<commit_message>
feat: Add radar report rendering and update DOCX insertion logic
</commit_message>
<xml_diff>
--- a/data/templates/TeamReportTemplate.docx
+++ b/data/templates/TeamReportTemplate.docx
@@ -649,131 +649,212 @@
         </w:rPr>
       </w:pPr>
     </w:p>
+    <w:tbl>
+      <w:tblPr>
+        <w:tblStyle w:val="Tabellenraster"/>
+        <w:tblW w:w="0" w:type="auto"/>
+        <w:tblLayout w:type="fixed"/>
+        <w:tblLook w:val="04A0" w:firstRow="1" w:lastRow="0" w:firstColumn="1" w:lastColumn="0" w:noHBand="0" w:noVBand="1"/>
+      </w:tblPr>
+      <w:tblGrid>
+        <w:gridCol w:w="5202"/>
+        <w:gridCol w:w="5202"/>
+      </w:tblGrid>
+      <w:tr>
+        <w:trPr>
+          <w:trHeight w:val="4803"/>
+        </w:trPr>
+        <w:tc>
+          <w:tcPr>
+            <w:tcW w:w="5202" w:type="dxa"/>
+          </w:tcPr>
+          <w:p>
+            <w:pPr>
+              <w:rPr>
+                <w:lang w:val="de-DE"/>
+              </w:rPr>
+            </w:pPr>
+            <w:r>
+              <w:rPr>
+                <w:noProof/>
+                <w:lang w:val="de-DE"/>
+              </w:rPr>
+              <w:drawing>
+                <wp:inline distT="0" distB="0" distL="0" distR="0" wp14:anchorId="43B6DE0B" wp14:editId="00426471">
+                  <wp:extent cx="3182400" cy="3016800"/>
+                  <wp:effectExtent l="0" t="0" r="0" b="0"/>
+                  <wp:docPr id="1808676826" name="Grafik 2"/>
+                  <wp:cNvGraphicFramePr>
+                    <a:graphicFrameLocks xmlns:a="http://schemas.openxmlformats.org/drawingml/2006/main" noChangeAspect="1"/>
+                  </wp:cNvGraphicFramePr>
+                  <a:graphic xmlns:a="http://schemas.openxmlformats.org/drawingml/2006/main">
+                    <a:graphicData uri="http://schemas.openxmlformats.org/drawingml/2006/picture">
+                      <pic:pic xmlns:pic="http://schemas.openxmlformats.org/drawingml/2006/picture">
+                        <pic:nvPicPr>
+                          <pic:cNvPr id="1808676826" name="Grafik 1808676826"/>
+                          <pic:cNvPicPr/>
+                        </pic:nvPicPr>
+                        <pic:blipFill>
+                          <a:blip r:embed="rId5">
+                            <a:extLst>
+                              <a:ext uri="{96DAC541-7B7A-43D3-8B79-37D633B846F1}">
+                                <asvg:svgBlip xmlns:asvg="http://schemas.microsoft.com/office/drawing/2016/SVG/main" r:embed="rId6"/>
+                              </a:ext>
+                            </a:extLst>
+                          </a:blip>
+                          <a:stretch>
+                            <a:fillRect/>
+                          </a:stretch>
+                        </pic:blipFill>
+                        <pic:spPr>
+                          <a:xfrm>
+                            <a:off x="0" y="0"/>
+                            <a:ext cx="3182400" cy="3016800"/>
+                          </a:xfrm>
+                          <a:prstGeom prst="rect">
+                            <a:avLst/>
+                          </a:prstGeom>
+                        </pic:spPr>
+                      </pic:pic>
+                    </a:graphicData>
+                  </a:graphic>
+                </wp:inline>
+              </w:drawing>
+            </w:r>
+          </w:p>
+        </w:tc>
+        <w:tc>
+          <w:tcPr>
+            <w:tcW w:w="5202" w:type="dxa"/>
+          </w:tcPr>
+          <w:p>
+            <w:pPr>
+              <w:rPr>
+                <w:lang w:val="de-DE"/>
+              </w:rPr>
+            </w:pPr>
+            <w:r>
+              <w:rPr>
+                <w:noProof/>
+                <w:lang w:val="de-DE"/>
+              </w:rPr>
+              <w:drawing>
+                <wp:inline distT="0" distB="0" distL="0" distR="0" wp14:anchorId="70CCF643" wp14:editId="02105BBC">
+                  <wp:extent cx="3182400" cy="3016800"/>
+                  <wp:effectExtent l="0" t="0" r="0" b="0"/>
+                  <wp:docPr id="509257373" name="Grafik 2"/>
+                  <wp:cNvGraphicFramePr>
+                    <a:graphicFrameLocks xmlns:a="http://schemas.openxmlformats.org/drawingml/2006/main" noChangeAspect="1"/>
+                  </wp:cNvGraphicFramePr>
+                  <a:graphic xmlns:a="http://schemas.openxmlformats.org/drawingml/2006/main">
+                    <a:graphicData uri="http://schemas.openxmlformats.org/drawingml/2006/picture">
+                      <pic:pic xmlns:pic="http://schemas.openxmlformats.org/drawingml/2006/picture">
+                        <pic:nvPicPr>
+                          <pic:cNvPr id="1808676826" name="Grafik 1808676826"/>
+                          <pic:cNvPicPr/>
+                        </pic:nvPicPr>
+                        <pic:blipFill>
+                          <a:blip r:embed="rId5">
+                            <a:extLst>
+                              <a:ext uri="{96DAC541-7B7A-43D3-8B79-37D633B846F1}">
+                                <asvg:svgBlip xmlns:asvg="http://schemas.microsoft.com/office/drawing/2016/SVG/main" r:embed="rId6"/>
+                              </a:ext>
+                            </a:extLst>
+                          </a:blip>
+                          <a:stretch>
+                            <a:fillRect/>
+                          </a:stretch>
+                        </pic:blipFill>
+                        <pic:spPr>
+                          <a:xfrm>
+                            <a:off x="0" y="0"/>
+                            <a:ext cx="3182400" cy="3016800"/>
+                          </a:xfrm>
+                          <a:prstGeom prst="rect">
+                            <a:avLst/>
+                          </a:prstGeom>
+                        </pic:spPr>
+                      </pic:pic>
+                    </a:graphicData>
+                  </a:graphic>
+                </wp:inline>
+              </w:drawing>
+            </w:r>
+          </w:p>
+        </w:tc>
+      </w:tr>
+      <w:tr>
+        <w:trPr>
+          <w:trHeight w:val="4803"/>
+        </w:trPr>
+        <w:tc>
+          <w:tcPr>
+            <w:tcW w:w="10404" w:type="dxa"/>
+            <w:gridSpan w:val="2"/>
+          </w:tcPr>
+          <w:p>
+            <w:pPr>
+              <w:rPr>
+                <w:lang w:val="de-DE"/>
+              </w:rPr>
+            </w:pPr>
+            <w:r>
+              <w:rPr>
+                <w:noProof/>
+                <w:lang w:val="de-DE"/>
+              </w:rPr>
+              <w:drawing>
+                <wp:inline distT="0" distB="0" distL="0" distR="0" wp14:anchorId="4C7988B1" wp14:editId="4B854589">
+                  <wp:extent cx="6502400" cy="3016250"/>
+                  <wp:effectExtent l="0" t="0" r="0" b="0"/>
+                  <wp:docPr id="412279519" name="Grafik 2"/>
+                  <wp:cNvGraphicFramePr>
+                    <a:graphicFrameLocks xmlns:a="http://schemas.openxmlformats.org/drawingml/2006/main" noChangeAspect="1"/>
+                  </wp:cNvGraphicFramePr>
+                  <a:graphic xmlns:a="http://schemas.openxmlformats.org/drawingml/2006/main">
+                    <a:graphicData uri="http://schemas.openxmlformats.org/drawingml/2006/picture">
+                      <pic:pic xmlns:pic="http://schemas.openxmlformats.org/drawingml/2006/picture">
+                        <pic:nvPicPr>
+                          <pic:cNvPr id="1808676826" name="Grafik 1808676826"/>
+                          <pic:cNvPicPr/>
+                        </pic:nvPicPr>
+                        <pic:blipFill>
+                          <a:blip r:embed="rId5">
+                            <a:extLst>
+                              <a:ext uri="{96DAC541-7B7A-43D3-8B79-37D633B846F1}">
+                                <asvg:svgBlip xmlns:asvg="http://schemas.microsoft.com/office/drawing/2016/SVG/main" r:embed="rId6"/>
+                              </a:ext>
+                            </a:extLst>
+                          </a:blip>
+                          <a:stretch>
+                            <a:fillRect/>
+                          </a:stretch>
+                        </pic:blipFill>
+                        <pic:spPr>
+                          <a:xfrm>
+                            <a:off x="0" y="0"/>
+                            <a:ext cx="6503588" cy="3016801"/>
+                          </a:xfrm>
+                          <a:prstGeom prst="rect">
+                            <a:avLst/>
+                          </a:prstGeom>
+                        </pic:spPr>
+                      </pic:pic>
+                    </a:graphicData>
+                  </a:graphic>
+                </wp:inline>
+              </w:drawing>
+            </w:r>
+          </w:p>
+        </w:tc>
+      </w:tr>
+    </w:tbl>
     <w:p>
       <w:pPr>
         <w:rPr>
           <w:lang w:val="de-DE"/>
         </w:rPr>
       </w:pPr>
-      <w:r>
-        <w:rPr>
-          <w:noProof/>
-          <w:lang w:val="de-DE"/>
-        </w:rPr>
-        <mc:AlternateContent>
-          <mc:Choice Requires="wps">
-            <w:drawing>
-              <wp:anchor distT="45720" distB="45720" distL="114300" distR="114300" simplePos="0" relativeHeight="251660288" behindDoc="0" locked="0" layoutInCell="1" allowOverlap="1" wp14:anchorId="1A8CC181" wp14:editId="2BF1C924">
-                <wp:simplePos x="0" y="0"/>
-                <wp:positionH relativeFrom="margin">
-                  <wp:align>right</wp:align>
-                </wp:positionH>
-                <wp:positionV relativeFrom="paragraph">
-                  <wp:posOffset>217805</wp:posOffset>
-                </wp:positionV>
-                <wp:extent cx="6623050" cy="6311900"/>
-                <wp:effectExtent l="0" t="0" r="25400" b="12700"/>
-                <wp:wrapSquare wrapText="bothSides"/>
-                <wp:docPr id="217" name="Textfeld 2"/>
-                <wp:cNvGraphicFramePr>
-                  <a:graphicFrameLocks xmlns:a="http://schemas.openxmlformats.org/drawingml/2006/main"/>
-                </wp:cNvGraphicFramePr>
-                <a:graphic xmlns:a="http://schemas.openxmlformats.org/drawingml/2006/main">
-                  <a:graphicData uri="http://schemas.microsoft.com/office/word/2010/wordprocessingShape">
-                    <wps:wsp>
-                      <wps:cNvSpPr txBox="1">
-                        <a:spLocks noChangeArrowheads="1"/>
-                      </wps:cNvSpPr>
-                      <wps:spPr bwMode="auto">
-                        <a:xfrm>
-                          <a:off x="0" y="0"/>
-                          <a:ext cx="6623050" cy="6311900"/>
-                        </a:xfrm>
-                        <a:prstGeom prst="rect">
-                          <a:avLst/>
-                        </a:prstGeom>
-                        <a:solidFill>
-                          <a:srgbClr val="FFFFFF"/>
-                        </a:solidFill>
-                        <a:ln w="9525">
-                          <a:solidFill>
-                            <a:srgbClr val="000000"/>
-                          </a:solidFill>
-                          <a:miter lim="800000"/>
-                          <a:headEnd/>
-                          <a:tailEnd/>
-                        </a:ln>
-                      </wps:spPr>
-                      <wps:txbx>
-                        <w:txbxContent>
-                          <w:p>
-                            <w:pPr>
-                              <w:rPr>
-                                <w:lang w:val="de-DE"/>
-                              </w:rPr>
-                            </w:pPr>
-                          </w:p>
-                        </w:txbxContent>
-                      </wps:txbx>
-                      <wps:bodyPr rot="0" vert="horz" wrap="square" lIns="91440" tIns="45720" rIns="91440" bIns="45720" anchor="t" anchorCtr="0">
-                        <a:noAutofit/>
-                      </wps:bodyPr>
-                    </wps:wsp>
-                  </a:graphicData>
-                </a:graphic>
-                <wp14:sizeRelH relativeFrom="margin">
-                  <wp14:pctWidth>0</wp14:pctWidth>
-                </wp14:sizeRelH>
-                <wp14:sizeRelV relativeFrom="margin">
-                  <wp14:pctHeight>0</wp14:pctHeight>
-                </wp14:sizeRelV>
-              </wp:anchor>
-            </w:drawing>
-          </mc:Choice>
-          <mc:Fallback>
-            <w:pict>
-              <v:shapetype w14:anchorId="1A8CC181" id="_x0000_t202" coordsize="21600,21600" o:spt="202" path="m,l,21600r21600,l21600,xe">
-                <v:stroke joinstyle="miter"/>
-                <v:path gradientshapeok="t" o:connecttype="rect"/>
-              </v:shapetype>
-              <v:shape id="Textfeld 2" o:spid="_x0000_s1026" type="#_x0000_t202" style="position:absolute;margin-left:470.3pt;margin-top:17.15pt;width:521.5pt;height:497pt;z-index:251660288;visibility:visible;mso-wrap-style:square;mso-width-percent:0;mso-height-percent:0;mso-wrap-distance-left:9pt;mso-wrap-distance-top:3.6pt;mso-wrap-distance-right:9pt;mso-wrap-distance-bottom:3.6pt;mso-position-horizontal:right;mso-position-horizontal-relative:margin;mso-position-vertical:absolute;mso-position-vertical-relative:text;mso-width-percent:0;mso-height-percent:0;mso-width-relative:margin;mso-height-relative:margin;v-text-anchor:top" o:gfxdata="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">
-                <v:textbox>
-                  <w:txbxContent>
-                    <w:p>
-                      <w:pPr>
-                        <w:rPr>
-                          <w:lang w:val="de-DE"/>
-                        </w:rPr>
-                      </w:pPr>
-                    </w:p>
-                  </w:txbxContent>
-                </v:textbox>
-                <w10:wrap type="square" anchorx="margin"/>
-              </v:shape>
-            </w:pict>
-          </mc:Fallback>
-        </mc:AlternateContent>
-      </w:r>
-      <w:r>
-        <w:rPr>
-          <w:lang w:val="de-DE"/>
-        </w:rPr>
-        <w:t>{</w:t>
-      </w:r>
-      <w:proofErr w:type="spellStart"/>
-      <w:r>
-        <w:rPr>
-          <w:lang w:val="de-DE"/>
-        </w:rPr>
-        <w:t>RadarPlot</w:t>
-      </w:r>
-      <w:proofErr w:type="spellEnd"/>
-      <w:r>
-        <w:rPr>
-          <w:lang w:val="de-DE"/>
-        </w:rPr>
-        <w:t>}</w:t>
-      </w:r>
     </w:p>
     <w:sectPr>
       <w:pgSz w:w="11906" w:h="16838"/>

</xml_diff>

<commit_message>
Add new quiz file for Josef dated 20260511
- Created a new Excel file containing quiz data for Josef.
- The file includes various worksheets and shared strings necessary for the quiz functionality.
</commit_message>
<xml_diff>
--- a/data/templates/TeamReportTemplate.docx
+++ b/data/templates/TeamReportTemplate.docx
@@ -36,7 +36,7 @@
                     <pic:cNvPicPr/>
                   </pic:nvPicPr>
                   <pic:blipFill>
-                    <a:blip r:embed="rId4" cstate="print">
+                    <a:blip r:embed="rId6" cstate="print">
                       <a:extLst>
                         <a:ext uri="{28A0092B-C50C-407E-A947-70E740481C1C}">
                           <a14:useLocalDpi xmlns:a14="http://schemas.microsoft.com/office/drawing/2010/main" val="0"/>
@@ -652,24 +652,33 @@
     <w:tbl>
       <w:tblPr>
         <w:tblStyle w:val="Tabellenraster"/>
-        <w:tblW w:w="0" w:type="auto"/>
+        <w:tblW w:w="10358" w:type="dxa"/>
+        <w:tblBorders>
+          <w:top w:val="none" w:sz="0" w:space="0" w:color="auto"/>
+          <w:left w:val="none" w:sz="0" w:space="0" w:color="auto"/>
+          <w:bottom w:val="none" w:sz="0" w:space="0" w:color="auto"/>
+          <w:right w:val="none" w:sz="0" w:space="0" w:color="auto"/>
+          <w:insideH w:val="none" w:sz="0" w:space="0" w:color="auto"/>
+          <w:insideV w:val="none" w:sz="0" w:space="0" w:color="auto"/>
+        </w:tblBorders>
         <w:tblLayout w:type="fixed"/>
         <w:tblLook w:val="04A0" w:firstRow="1" w:lastRow="0" w:firstColumn="1" w:lastColumn="0" w:noHBand="0" w:noVBand="1"/>
       </w:tblPr>
       <w:tblGrid>
-        <w:gridCol w:w="5202"/>
-        <w:gridCol w:w="5202"/>
+        <w:gridCol w:w="5176"/>
+        <w:gridCol w:w="5182"/>
       </w:tblGrid>
       <w:tr>
         <w:trPr>
-          <w:trHeight w:val="4803"/>
+          <w:trHeight w:val="4388"/>
         </w:trPr>
         <w:tc>
           <w:tcPr>
-            <w:tcW w:w="5202" w:type="dxa"/>
+            <w:tcW w:w="5176" w:type="dxa"/>
           </w:tcPr>
           <w:p>
             <w:pPr>
+              <w:jc w:val="center"/>
               <w:rPr>
                 <w:lang w:val="de-DE"/>
               </w:rPr>
@@ -680,9 +689,9 @@
                 <w:lang w:val="de-DE"/>
               </w:rPr>
               <w:drawing>
-                <wp:inline distT="0" distB="0" distL="0" distR="0" wp14:anchorId="43B6DE0B" wp14:editId="00426471">
-                  <wp:extent cx="3182400" cy="3016800"/>
-                  <wp:effectExtent l="0" t="0" r="0" b="0"/>
+                <wp:inline distT="0" distB="0" distL="0" distR="0" wp14:anchorId="43B6DE0B" wp14:editId="62505D52">
+                  <wp:extent cx="3232150" cy="3063961"/>
+                  <wp:effectExtent l="0" t="0" r="6350" b="3175"/>
                   <wp:docPr id="1808676826" name="Grafik 2"/>
                   <wp:cNvGraphicFramePr>
                     <a:graphicFrameLocks xmlns:a="http://schemas.openxmlformats.org/drawingml/2006/main" noChangeAspect="1"/>
@@ -695,10 +704,10 @@
                           <pic:cNvPicPr/>
                         </pic:nvPicPr>
                         <pic:blipFill>
-                          <a:blip r:embed="rId5">
+                          <a:blip r:embed="rId7">
                             <a:extLst>
                               <a:ext uri="{96DAC541-7B7A-43D3-8B79-37D633B846F1}">
-                                <asvg:svgBlip xmlns:asvg="http://schemas.microsoft.com/office/drawing/2016/SVG/main" r:embed="rId6"/>
+                                <asvg:svgBlip xmlns:asvg="http://schemas.microsoft.com/office/drawing/2016/SVG/main" r:embed="rId8"/>
                               </a:ext>
                             </a:extLst>
                           </a:blip>
@@ -709,7 +718,7 @@
                         <pic:spPr>
                           <a:xfrm>
                             <a:off x="0" y="0"/>
-                            <a:ext cx="3182400" cy="3016800"/>
+                            <a:ext cx="3233068" cy="3064831"/>
                           </a:xfrm>
                           <a:prstGeom prst="rect">
                             <a:avLst/>
@@ -725,10 +734,11 @@
         </w:tc>
         <w:tc>
           <w:tcPr>
-            <w:tcW w:w="5202" w:type="dxa"/>
+            <w:tcW w:w="5182" w:type="dxa"/>
           </w:tcPr>
           <w:p>
             <w:pPr>
+              <w:jc w:val="center"/>
               <w:rPr>
                 <w:lang w:val="de-DE"/>
               </w:rPr>
@@ -739,8 +749,8 @@
                 <w:lang w:val="de-DE"/>
               </w:rPr>
               <w:drawing>
-                <wp:inline distT="0" distB="0" distL="0" distR="0" wp14:anchorId="70CCF643" wp14:editId="02105BBC">
-                  <wp:extent cx="3182400" cy="3016800"/>
+                <wp:inline distT="0" distB="0" distL="0" distR="0" wp14:anchorId="70CCF643" wp14:editId="613F73E4">
+                  <wp:extent cx="3276600" cy="3106098"/>
                   <wp:effectExtent l="0" t="0" r="0" b="0"/>
                   <wp:docPr id="509257373" name="Grafik 2"/>
                   <wp:cNvGraphicFramePr>
@@ -754,10 +764,10 @@
                           <pic:cNvPicPr/>
                         </pic:nvPicPr>
                         <pic:blipFill>
-                          <a:blip r:embed="rId5">
+                          <a:blip r:embed="rId7">
                             <a:extLst>
                               <a:ext uri="{96DAC541-7B7A-43D3-8B79-37D633B846F1}">
-                                <asvg:svgBlip xmlns:asvg="http://schemas.microsoft.com/office/drawing/2016/SVG/main" r:embed="rId6"/>
+                                <asvg:svgBlip xmlns:asvg="http://schemas.microsoft.com/office/drawing/2016/SVG/main" r:embed="rId8"/>
                               </a:ext>
                             </a:extLst>
                           </a:blip>
@@ -768,7 +778,7 @@
                         <pic:spPr>
                           <a:xfrm>
                             <a:off x="0" y="0"/>
-                            <a:ext cx="3182400" cy="3016800"/>
+                            <a:ext cx="3278051" cy="3107473"/>
                           </a:xfrm>
                           <a:prstGeom prst="rect">
                             <a:avLst/>
@@ -785,15 +795,16 @@
       </w:tr>
       <w:tr>
         <w:trPr>
-          <w:trHeight w:val="4803"/>
+          <w:trHeight w:val="4388"/>
         </w:trPr>
         <w:tc>
           <w:tcPr>
-            <w:tcW w:w="10404" w:type="dxa"/>
+            <w:tcW w:w="10358" w:type="dxa"/>
             <w:gridSpan w:val="2"/>
           </w:tcPr>
           <w:p>
             <w:pPr>
+              <w:jc w:val="center"/>
               <w:rPr>
                 <w:lang w:val="de-DE"/>
               </w:rPr>
@@ -804,9 +815,9 @@
                 <w:lang w:val="de-DE"/>
               </w:rPr>
               <w:drawing>
-                <wp:inline distT="0" distB="0" distL="0" distR="0" wp14:anchorId="4C7988B1" wp14:editId="4B854589">
-                  <wp:extent cx="6502400" cy="3016250"/>
-                  <wp:effectExtent l="0" t="0" r="0" b="0"/>
+                <wp:inline distT="0" distB="0" distL="0" distR="0" wp14:anchorId="4C7988B1" wp14:editId="19726E31">
+                  <wp:extent cx="5900400" cy="2736000"/>
+                  <wp:effectExtent l="0" t="0" r="5715" b="7620"/>
                   <wp:docPr id="412279519" name="Grafik 2"/>
                   <wp:cNvGraphicFramePr>
                     <a:graphicFrameLocks xmlns:a="http://schemas.openxmlformats.org/drawingml/2006/main" noChangeAspect="1"/>
@@ -819,10 +830,10 @@
                           <pic:cNvPicPr/>
                         </pic:nvPicPr>
                         <pic:blipFill>
-                          <a:blip r:embed="rId5">
+                          <a:blip r:embed="rId7">
                             <a:extLst>
                               <a:ext uri="{96DAC541-7B7A-43D3-8B79-37D633B846F1}">
-                                <asvg:svgBlip xmlns:asvg="http://schemas.microsoft.com/office/drawing/2016/SVG/main" r:embed="rId6"/>
+                                <asvg:svgBlip xmlns:asvg="http://schemas.microsoft.com/office/drawing/2016/SVG/main" r:embed="rId8"/>
                               </a:ext>
                             </a:extLst>
                           </a:blip>
@@ -833,7 +844,7 @@
                         <pic:spPr>
                           <a:xfrm>
                             <a:off x="0" y="0"/>
-                            <a:ext cx="6503588" cy="3016801"/>
+                            <a:ext cx="5900400" cy="2736000"/>
                           </a:xfrm>
                           <a:prstGeom prst="rect">
                             <a:avLst/>
@@ -852,11 +863,14 @@
     <w:p>
       <w:pPr>
         <w:rPr>
+          <w:sz w:val="6"/>
+          <w:szCs w:val="6"/>
           <w:lang w:val="de-DE"/>
         </w:rPr>
       </w:pPr>
     </w:p>
     <w:sectPr>
+      <w:footerReference w:type="default" r:id="rId9"/>
       <w:pgSz w:w="11906" w:h="16838"/>
       <w:pgMar w:top="720" w:right="720" w:bottom="720" w:left="720" w:header="708" w:footer="708" w:gutter="0"/>
       <w:cols w:space="708"/>
@@ -864,6 +878,131 @@
     </w:sectPr>
   </w:body>
 </w:document>
+</file>
+
+<file path=word/endnotes.xml><?xml version="1.0" encoding="utf-8"?>
+<w:endnotes xmlns:wpc="http://schemas.microsoft.com/office/word/2010/wordprocessingCanvas" xmlns:cx="http://schemas.microsoft.com/office/drawing/2014/chartex" xmlns:cx1="http://schemas.microsoft.com/office/drawing/2015/9/8/chartex" xmlns:cx2="http://schemas.microsoft.com/office/drawing/2015/10/21/chartex" xmlns:cx3="http://schemas.microsoft.com/office/drawing/2016/5/9/chartex" xmlns:cx4="http://schemas.microsoft.com/office/drawing/2016/5/10/chartex" xmlns:cx5="http://schemas.microsoft.com/office/drawing/2016/5/11/chartex" xmlns:cx6="http://schemas.microsoft.com/office/drawing/2016/5/12/chartex" xmlns:cx7="http://schemas.microsoft.com/office/drawing/2016/5/13/chartex" xmlns:cx8="http://schemas.microsoft.com/office/drawing/2016/5/14/chartex" xmlns:mc="http://schemas.openxmlformats.org/markup-compatibility/2006" xmlns:aink="http://schemas.microsoft.com/office/drawing/2016/ink" xmlns:am3d="http://schemas.microsoft.com/office/drawing/2017/model3d" xmlns:o="urn:schemas-microsoft-com:office:office" xmlns:oel="http://schemas.microsoft.com/office/2019/extlst" xmlns:r="http://schemas.openxmlformats.org/officeDocument/2006/relationships" xmlns:m="http://schemas.openxmlformats.org/officeDocument/2006/math" xmlns:v="urn:schemas-microsoft-com:vml" xmlns:wp14="http://schemas.microsoft.com/office/word/2010/wordprocessingDrawing" xmlns:wp="http://schemas.openxmlformats.org/drawingml/2006/wordprocessingDrawing" xmlns:w10="urn:schemas-microsoft-com:office:word" xmlns:w="http://schemas.openxmlformats.org/wordprocessingml/2006/main" xmlns:w14="http://schemas.microsoft.com/office/word/2010/wordml" xmlns:w15="http://schemas.microsoft.com/office/word/2012/wordml" xmlns:w16cex="http://schemas.microsoft.com/office/word/2018/wordml/cex" xmlns:w16cid="http://schemas.microsoft.com/office/word/2016/wordml/cid" xmlns:w16="http://schemas.microsoft.com/office/word/2018/wordml" xmlns:w16du="http://schemas.microsoft.com/office/word/2023/wordml/word16du" xmlns:w16sdtdh="http://schemas.microsoft.com/office/word/2020/wordml/sdtdatahash" xmlns:w16sdtfl="http://schemas.microsoft.com/office/word/2024/wordml/sdtformatlock" xmlns:w16se="http://schemas.microsoft.com/office/word/2015/wordml/symex" xmlns:wpg="http://schemas.microsoft.com/office/word/2010/wordprocessingGroup" xmlns:wpi="http://schemas.microsoft.com/office/word/2010/wordprocessingInk" xmlns:wne="http://schemas.microsoft.com/office/word/2006/wordml" xmlns:wps="http://schemas.microsoft.com/office/word/2010/wordprocessingShape" mc:Ignorable="w14 w15 w16se w16cid w16 w16cex w16sdtdh w16sdtfl w16du wp14">
+  <w:endnote w:type="separator" w:id="-1">
+    <w:p>
+      <w:pPr>
+        <w:spacing w:after="0" w:line="240" w:lineRule="auto"/>
+      </w:pPr>
+      <w:r>
+        <w:separator/>
+      </w:r>
+    </w:p>
+  </w:endnote>
+  <w:endnote w:type="continuationSeparator" w:id="0">
+    <w:p>
+      <w:pPr>
+        <w:spacing w:after="0" w:line="240" w:lineRule="auto"/>
+      </w:pPr>
+      <w:r>
+        <w:continuationSeparator/>
+      </w:r>
+    </w:p>
+  </w:endnote>
+</w:endnotes>
+</file>
+
+<file path=word/footer1.xml><?xml version="1.0" encoding="utf-8"?>
+<w:ftr xmlns:wpc="http://schemas.microsoft.com/office/word/2010/wordprocessingCanvas" xmlns:cx="http://schemas.microsoft.com/office/drawing/2014/chartex" xmlns:cx1="http://schemas.microsoft.com/office/drawing/2015/9/8/chartex" xmlns:cx2="http://schemas.microsoft.com/office/drawing/2015/10/21/chartex" xmlns:cx3="http://schemas.microsoft.com/office/drawing/2016/5/9/chartex" xmlns:cx4="http://schemas.microsoft.com/office/drawing/2016/5/10/chartex" xmlns:cx5="http://schemas.microsoft.com/office/drawing/2016/5/11/chartex" xmlns:cx6="http://schemas.microsoft.com/office/drawing/2016/5/12/chartex" xmlns:cx7="http://schemas.microsoft.com/office/drawing/2016/5/13/chartex" xmlns:cx8="http://schemas.microsoft.com/office/drawing/2016/5/14/chartex" xmlns:mc="http://schemas.openxmlformats.org/markup-compatibility/2006" xmlns:aink="http://schemas.microsoft.com/office/drawing/2016/ink" xmlns:am3d="http://schemas.microsoft.com/office/drawing/2017/model3d" xmlns:o="urn:schemas-microsoft-com:office:office" xmlns:oel="http://schemas.microsoft.com/office/2019/extlst" xmlns:r="http://schemas.openxmlformats.org/officeDocument/2006/relationships" xmlns:m="http://schemas.openxmlformats.org/officeDocument/2006/math" xmlns:v="urn:schemas-microsoft-com:vml" xmlns:wp14="http://schemas.microsoft.com/office/word/2010/wordprocessingDrawing" xmlns:wp="http://schemas.openxmlformats.org/drawingml/2006/wordprocessingDrawing" xmlns:w10="urn:schemas-microsoft-com:office:word" xmlns:w="http://schemas.openxmlformats.org/wordprocessingml/2006/main" xmlns:w14="http://schemas.microsoft.com/office/word/2010/wordml" xmlns:w15="http://schemas.microsoft.com/office/word/2012/wordml" xmlns:w16cex="http://schemas.microsoft.com/office/word/2018/wordml/cex" xmlns:w16cid="http://schemas.microsoft.com/office/word/2016/wordml/cid" xmlns:w16="http://schemas.microsoft.com/office/word/2018/wordml" xmlns:w16du="http://schemas.microsoft.com/office/word/2023/wordml/word16du" xmlns:w16sdtdh="http://schemas.microsoft.com/office/word/2020/wordml/sdtdatahash" xmlns:w16sdtfl="http://schemas.microsoft.com/office/word/2024/wordml/sdtformatlock" xmlns:w16se="http://schemas.microsoft.com/office/word/2015/wordml/symex" xmlns:wpg="http://schemas.microsoft.com/office/word/2010/wordprocessingGroup" xmlns:wpi="http://schemas.microsoft.com/office/word/2010/wordprocessingInk" xmlns:wne="http://schemas.microsoft.com/office/word/2006/wordml" xmlns:wps="http://schemas.microsoft.com/office/word/2010/wordprocessingShape" mc:Ignorable="w14 w15 w16se w16cid w16 w16cex w16sdtdh w16sdtfl w16du wp14">
+  <w:p>
+    <w:pPr>
+      <w:pStyle w:val="Fuzeile"/>
+      <w:rPr>
+        <w:sz w:val="12"/>
+        <w:szCs w:val="12"/>
+      </w:rPr>
+    </w:pPr>
+    <w:r>
+      <w:rPr>
+        <w:sz w:val="12"/>
+        <w:szCs w:val="12"/>
+      </w:rPr>
+      <w:t xml:space="preserve">Report </w:t>
+    </w:r>
+    <w:proofErr w:type="spellStart"/>
+    <w:r>
+      <w:rPr>
+        <w:sz w:val="12"/>
+        <w:szCs w:val="12"/>
+      </w:rPr>
+      <w:t>generated</w:t>
+    </w:r>
+    <w:proofErr w:type="spellEnd"/>
+    <w:r>
+      <w:rPr>
+        <w:sz w:val="12"/>
+        <w:szCs w:val="12"/>
+      </w:rPr>
+      <w:t xml:space="preserve"> </w:t>
+    </w:r>
+    <w:proofErr w:type="spellStart"/>
+    <w:r>
+      <w:rPr>
+        <w:sz w:val="12"/>
+        <w:szCs w:val="12"/>
+      </w:rPr>
+      <w:t>by</w:t>
+    </w:r>
+    <w:proofErr w:type="spellEnd"/>
+    <w:r>
+      <w:rPr>
+        <w:sz w:val="12"/>
+        <w:szCs w:val="12"/>
+      </w:rPr>
+      <w:t xml:space="preserve"> Andreas REITER</w:t>
+    </w:r>
+    <w:r>
+      <w:rPr>
+        <w:sz w:val="12"/>
+        <w:szCs w:val="12"/>
+      </w:rPr>
+      <w:tab/>
+    </w:r>
+    <w:r>
+      <w:rPr>
+        <w:sz w:val="12"/>
+        <w:szCs w:val="12"/>
+      </w:rPr>
+      <w:tab/>
+    </w:r>
+    <w:r>
+      <w:rPr>
+        <w:sz w:val="12"/>
+        <w:szCs w:val="12"/>
+      </w:rPr>
+      <w:tab/>
+      <w:t>{Date}</w:t>
+    </w:r>
+  </w:p>
+</w:ftr>
+</file>
+
+<file path=word/footnotes.xml><?xml version="1.0" encoding="utf-8"?>
+<w:footnotes xmlns:wpc="http://schemas.microsoft.com/office/word/2010/wordprocessingCanvas" xmlns:cx="http://schemas.microsoft.com/office/drawing/2014/chartex" xmlns:cx1="http://schemas.microsoft.com/office/drawing/2015/9/8/chartex" xmlns:cx2="http://schemas.microsoft.com/office/drawing/2015/10/21/chartex" xmlns:cx3="http://schemas.microsoft.com/office/drawing/2016/5/9/chartex" xmlns:cx4="http://schemas.microsoft.com/office/drawing/2016/5/10/chartex" xmlns:cx5="http://schemas.microsoft.com/office/drawing/2016/5/11/chartex" xmlns:cx6="http://schemas.microsoft.com/office/drawing/2016/5/12/chartex" xmlns:cx7="http://schemas.microsoft.com/office/drawing/2016/5/13/chartex" xmlns:cx8="http://schemas.microsoft.com/office/drawing/2016/5/14/chartex" xmlns:mc="http://schemas.openxmlformats.org/markup-compatibility/2006" xmlns:aink="http://schemas.microsoft.com/office/drawing/2016/ink" xmlns:am3d="http://schemas.microsoft.com/office/drawing/2017/model3d" xmlns:o="urn:schemas-microsoft-com:office:office" xmlns:oel="http://schemas.microsoft.com/office/2019/extlst" xmlns:r="http://schemas.openxmlformats.org/officeDocument/2006/relationships" xmlns:m="http://schemas.openxmlformats.org/officeDocument/2006/math" xmlns:v="urn:schemas-microsoft-com:vml" xmlns:wp14="http://schemas.microsoft.com/office/word/2010/wordprocessingDrawing" xmlns:wp="http://schemas.openxmlformats.org/drawingml/2006/wordprocessingDrawing" xmlns:w10="urn:schemas-microsoft-com:office:word" xmlns:w="http://schemas.openxmlformats.org/wordprocessingml/2006/main" xmlns:w14="http://schemas.microsoft.com/office/word/2010/wordml" xmlns:w15="http://schemas.microsoft.com/office/word/2012/wordml" xmlns:w16cex="http://schemas.microsoft.com/office/word/2018/wordml/cex" xmlns:w16cid="http://schemas.microsoft.com/office/word/2016/wordml/cid" xmlns:w16="http://schemas.microsoft.com/office/word/2018/wordml" xmlns:w16du="http://schemas.microsoft.com/office/word/2023/wordml/word16du" xmlns:w16sdtdh="http://schemas.microsoft.com/office/word/2020/wordml/sdtdatahash" xmlns:w16sdtfl="http://schemas.microsoft.com/office/word/2024/wordml/sdtformatlock" xmlns:w16se="http://schemas.microsoft.com/office/word/2015/wordml/symex" xmlns:wpg="http://schemas.microsoft.com/office/word/2010/wordprocessingGroup" xmlns:wpi="http://schemas.microsoft.com/office/word/2010/wordprocessingInk" xmlns:wne="http://schemas.microsoft.com/office/word/2006/wordml" xmlns:wps="http://schemas.microsoft.com/office/word/2010/wordprocessingShape" mc:Ignorable="w14 w15 w16se w16cid w16 w16cex w16sdtdh w16sdtfl w16du wp14">
+  <w:footnote w:type="separator" w:id="-1">
+    <w:p>
+      <w:pPr>
+        <w:spacing w:after="0" w:line="240" w:lineRule="auto"/>
+      </w:pPr>
+      <w:r>
+        <w:separator/>
+      </w:r>
+    </w:p>
+  </w:footnote>
+  <w:footnote w:type="continuationSeparator" w:id="0">
+    <w:p>
+      <w:pPr>
+        <w:spacing w:after="0" w:line="240" w:lineRule="auto"/>
+      </w:pPr>
+      <w:r>
+        <w:continuationSeparator/>
+      </w:r>
+    </w:p>
+  </w:footnote>
+</w:footnotes>
 </file>
 
 <file path=word/styles.xml><?xml version="1.0" encoding="utf-8"?>
@@ -1851,6 +1990,50 @@
       </w:tcPr>
     </w:tblStylePr>
   </w:style>
+  <w:style w:type="paragraph" w:styleId="Kopfzeile">
+    <w:name w:val="header"/>
+    <w:basedOn w:val="Standard"/>
+    <w:link w:val="KopfzeileZchn"/>
+    <w:uiPriority w:val="99"/>
+    <w:unhideWhenUsed/>
+    <w:rsid w:val="005F32D8"/>
+    <w:pPr>
+      <w:tabs>
+        <w:tab w:val="center" w:pos="4536"/>
+        <w:tab w:val="right" w:pos="9072"/>
+      </w:tabs>
+      <w:spacing w:after="0" w:line="240" w:lineRule="auto"/>
+    </w:pPr>
+  </w:style>
+  <w:style w:type="character" w:customStyle="1" w:styleId="KopfzeileZchn">
+    <w:name w:val="Kopfzeile Zchn"/>
+    <w:basedOn w:val="Absatz-Standardschriftart"/>
+    <w:link w:val="Kopfzeile"/>
+    <w:uiPriority w:val="99"/>
+    <w:rsid w:val="005F32D8"/>
+  </w:style>
+  <w:style w:type="paragraph" w:styleId="Fuzeile">
+    <w:name w:val="footer"/>
+    <w:basedOn w:val="Standard"/>
+    <w:link w:val="FuzeileZchn"/>
+    <w:uiPriority w:val="99"/>
+    <w:unhideWhenUsed/>
+    <w:rsid w:val="005F32D8"/>
+    <w:pPr>
+      <w:tabs>
+        <w:tab w:val="center" w:pos="4536"/>
+        <w:tab w:val="right" w:pos="9072"/>
+      </w:tabs>
+      <w:spacing w:after="0" w:line="240" w:lineRule="auto"/>
+    </w:pPr>
+  </w:style>
+  <w:style w:type="character" w:customStyle="1" w:styleId="FuzeileZchn">
+    <w:name w:val="Fußzeile Zchn"/>
+    <w:basedOn w:val="Absatz-Standardschriftart"/>
+    <w:link w:val="Fuzeile"/>
+    <w:uiPriority w:val="99"/>
+    <w:rsid w:val="005F32D8"/>
+  </w:style>
 </w:styles>
 </file>
 

</xml_diff>

<commit_message>
feat: Add functionality to generate all team reports and update team name aliases
</commit_message>
<xml_diff>
--- a/data/templates/TeamReportTemplate.docx
+++ b/data/templates/TeamReportTemplate.docx
@@ -645,6 +645,8 @@
     <w:p>
       <w:pPr>
         <w:rPr>
+          <w:sz w:val="8"/>
+          <w:szCs w:val="8"/>
           <w:lang w:val="de-DE"/>
         </w:rPr>
       </w:pPr>
@@ -652,7 +654,7 @@
     <w:tbl>
       <w:tblPr>
         <w:tblStyle w:val="Tabellenraster"/>
-        <w:tblW w:w="10358" w:type="dxa"/>
+        <w:tblW w:w="10320" w:type="dxa"/>
         <w:tblBorders>
           <w:top w:val="none" w:sz="0" w:space="0" w:color="auto"/>
           <w:left w:val="none" w:sz="0" w:space="0" w:color="auto"/>
@@ -665,16 +667,16 @@
         <w:tblLook w:val="04A0" w:firstRow="1" w:lastRow="0" w:firstColumn="1" w:lastColumn="0" w:noHBand="0" w:noVBand="1"/>
       </w:tblPr>
       <w:tblGrid>
-        <w:gridCol w:w="5176"/>
-        <w:gridCol w:w="5182"/>
+        <w:gridCol w:w="5156"/>
+        <w:gridCol w:w="5164"/>
       </w:tblGrid>
       <w:tr>
         <w:trPr>
-          <w:trHeight w:val="4388"/>
+          <w:trHeight w:val="4512"/>
         </w:trPr>
         <w:tc>
           <w:tcPr>
-            <w:tcW w:w="5176" w:type="dxa"/>
+            <w:tcW w:w="5156" w:type="dxa"/>
           </w:tcPr>
           <w:p>
             <w:pPr>
@@ -689,9 +691,9 @@
                 <w:lang w:val="de-DE"/>
               </w:rPr>
               <w:drawing>
-                <wp:inline distT="0" distB="0" distL="0" distR="0" wp14:anchorId="43B6DE0B" wp14:editId="62505D52">
-                  <wp:extent cx="3232150" cy="3063961"/>
-                  <wp:effectExtent l="0" t="0" r="6350" b="3175"/>
+                <wp:inline distT="0" distB="0" distL="0" distR="0" wp14:anchorId="43B6DE0B" wp14:editId="3881C6BE">
+                  <wp:extent cx="2880000" cy="2728800"/>
+                  <wp:effectExtent l="0" t="0" r="0" b="0"/>
                   <wp:docPr id="1808676826" name="Grafik 2"/>
                   <wp:cNvGraphicFramePr>
                     <a:graphicFrameLocks xmlns:a="http://schemas.openxmlformats.org/drawingml/2006/main" noChangeAspect="1"/>
@@ -718,7 +720,7 @@
                         <pic:spPr>
                           <a:xfrm>
                             <a:off x="0" y="0"/>
-                            <a:ext cx="3233068" cy="3064831"/>
+                            <a:ext cx="2880000" cy="2728800"/>
                           </a:xfrm>
                           <a:prstGeom prst="rect">
                             <a:avLst/>
@@ -734,7 +736,7 @@
         </w:tc>
         <w:tc>
           <w:tcPr>
-            <w:tcW w:w="5182" w:type="dxa"/>
+            <w:tcW w:w="5163" w:type="dxa"/>
           </w:tcPr>
           <w:p>
             <w:pPr>
@@ -749,8 +751,8 @@
                 <w:lang w:val="de-DE"/>
               </w:rPr>
               <w:drawing>
-                <wp:inline distT="0" distB="0" distL="0" distR="0" wp14:anchorId="70CCF643" wp14:editId="613F73E4">
-                  <wp:extent cx="3276600" cy="3106098"/>
+                <wp:inline distT="0" distB="0" distL="0" distR="0" wp14:anchorId="70CCF643" wp14:editId="65B236AC">
+                  <wp:extent cx="2880000" cy="2728800"/>
                   <wp:effectExtent l="0" t="0" r="0" b="0"/>
                   <wp:docPr id="509257373" name="Grafik 2"/>
                   <wp:cNvGraphicFramePr>
@@ -778,7 +780,7 @@
                         <pic:spPr>
                           <a:xfrm>
                             <a:off x="0" y="0"/>
-                            <a:ext cx="3278051" cy="3107473"/>
+                            <a:ext cx="2880000" cy="2728800"/>
                           </a:xfrm>
                           <a:prstGeom prst="rect">
                             <a:avLst/>
@@ -795,12 +797,13 @@
       </w:tr>
       <w:tr>
         <w:trPr>
-          <w:trHeight w:val="4388"/>
+          <w:trHeight w:val="5091"/>
         </w:trPr>
         <w:tc>
           <w:tcPr>
-            <w:tcW w:w="10358" w:type="dxa"/>
+            <w:tcW w:w="10320" w:type="dxa"/>
             <w:gridSpan w:val="2"/>
+            <w:vAlign w:val="center"/>
           </w:tcPr>
           <w:p>
             <w:pPr>
@@ -815,12 +818,12 @@
                 <w:lang w:val="de-DE"/>
               </w:rPr>
               <w:drawing>
-                <wp:inline distT="0" distB="0" distL="0" distR="0" wp14:anchorId="4C7988B1" wp14:editId="19726E31">
-                  <wp:extent cx="5900400" cy="2736000"/>
-                  <wp:effectExtent l="0" t="0" r="5715" b="7620"/>
+                <wp:inline distT="0" distB="0" distL="0" distR="0" wp14:anchorId="4C7988B1" wp14:editId="62062E87">
+                  <wp:extent cx="6480000" cy="3240000"/>
+                  <wp:effectExtent l="0" t="0" r="0" b="0"/>
                   <wp:docPr id="412279519" name="Grafik 2"/>
                   <wp:cNvGraphicFramePr>
-                    <a:graphicFrameLocks xmlns:a="http://schemas.openxmlformats.org/drawingml/2006/main" noChangeAspect="1"/>
+                    <a:graphicFrameLocks xmlns:a="http://schemas.openxmlformats.org/drawingml/2006/main"/>
                   </wp:cNvGraphicFramePr>
                   <a:graphic xmlns:a="http://schemas.openxmlformats.org/drawingml/2006/main">
                     <a:graphicData uri="http://schemas.openxmlformats.org/drawingml/2006/picture">
@@ -844,7 +847,7 @@
                         <pic:spPr>
                           <a:xfrm>
                             <a:off x="0" y="0"/>
-                            <a:ext cx="5900400" cy="2736000"/>
+                            <a:ext cx="6480000" cy="3240000"/>
                           </a:xfrm>
                           <a:prstGeom prst="rect">
                             <a:avLst/>

</xml_diff>

<commit_message>
feat: Update team report templates and remove outdated quiz file
</commit_message>
<xml_diff>
--- a/data/templates/TeamReportTemplate.docx
+++ b/data/templates/TeamReportTemplate.docx
@@ -10,6 +10,7 @@
       </w:pPr>
       <w:r>
         <w:rPr>
+          <w:noProof/>
           <w:lang w:val="de-DE"/>
         </w:rPr>
         <w:drawing>
@@ -157,21 +158,7 @@
               <w:rPr>
                 <w:lang w:val="de-DE"/>
               </w:rPr>
-              <w:t>{</w:t>
-            </w:r>
-            <w:proofErr w:type="spellStart"/>
-            <w:r>
-              <w:rPr>
-                <w:lang w:val="de-DE"/>
-              </w:rPr>
-              <w:t>ChampionshipPoints</w:t>
-            </w:r>
-            <w:proofErr w:type="spellEnd"/>
-            <w:r>
-              <w:rPr>
-                <w:lang w:val="de-DE"/>
-              </w:rPr>
-              <w:t>}</w:t>
+              <w:t>{ChampionshipPoints}</w:t>
             </w:r>
           </w:p>
         </w:tc>
@@ -215,21 +202,7 @@
               <w:rPr>
                 <w:lang w:val="de-DE"/>
               </w:rPr>
-              <w:t>{</w:t>
-            </w:r>
-            <w:proofErr w:type="spellStart"/>
-            <w:r>
-              <w:rPr>
-                <w:lang w:val="de-DE"/>
-              </w:rPr>
-              <w:t>ChampionshipPosition</w:t>
-            </w:r>
-            <w:proofErr w:type="spellEnd"/>
-            <w:r>
-              <w:rPr>
-                <w:lang w:val="de-DE"/>
-              </w:rPr>
-              <w:t>}</w:t>
+              <w:t>{ChampionshipPosition}</w:t>
             </w:r>
             <w:r>
               <w:rPr>
@@ -276,47 +249,7 @@
               <w:rPr>
                 <w:lang w:val="de-DE"/>
               </w:rPr>
-              <w:t>{</w:t>
-            </w:r>
-            <w:proofErr w:type="spellStart"/>
-            <w:r>
-              <w:rPr>
-                <w:lang w:val="de-DE"/>
-              </w:rPr>
-              <w:t>BestPos</w:t>
-            </w:r>
-            <w:proofErr w:type="spellEnd"/>
-            <w:r>
-              <w:rPr>
-                <w:lang w:val="de-DE"/>
-              </w:rPr>
-              <w:t xml:space="preserve">} </w:t>
-            </w:r>
-            <w:r>
-              <w:rPr>
-                <w:lang w:val="de-DE"/>
-              </w:rPr>
-              <w:t>–</w:t>
-            </w:r>
-            <w:r>
-              <w:rPr>
-                <w:lang w:val="de-DE"/>
-              </w:rPr>
-              <w:t xml:space="preserve"> {</w:t>
-            </w:r>
-            <w:proofErr w:type="spellStart"/>
-            <w:r>
-              <w:rPr>
-                <w:lang w:val="de-DE"/>
-              </w:rPr>
-              <w:t>DateBestPos</w:t>
-            </w:r>
-            <w:proofErr w:type="spellEnd"/>
-            <w:r>
-              <w:rPr>
-                <w:lang w:val="de-DE"/>
-              </w:rPr>
-              <w:t xml:space="preserve">} </w:t>
+              <w:t xml:space="preserve">{BestPos} – {DateBestPos} </w:t>
             </w:r>
             <w:r>
               <w:rPr>
@@ -328,16 +261,8 @@
               <w:rPr>
                 <w:lang w:val="de-DE"/>
               </w:rPr>
-              <w:t xml:space="preserve"> {</w:t>
-            </w:r>
-            <w:proofErr w:type="spellStart"/>
-            <w:r>
-              <w:rPr>
-                <w:lang w:val="de-DE"/>
-              </w:rPr>
-              <w:t>LocBestPos</w:t>
-            </w:r>
-            <w:proofErr w:type="spellEnd"/>
+              <w:t xml:space="preserve"> {LocBestPos</w:t>
+            </w:r>
             <w:r>
               <w:rPr>
                 <w:lang w:val="de-DE"/>
@@ -386,35 +311,7 @@
               <w:rPr>
                 <w:lang w:val="de-DE"/>
               </w:rPr>
-              <w:t>{</w:t>
-            </w:r>
-            <w:proofErr w:type="spellStart"/>
-            <w:r>
-              <w:rPr>
-                <w:lang w:val="de-DE"/>
-              </w:rPr>
-              <w:t>BestPoints</w:t>
-            </w:r>
-            <w:proofErr w:type="spellEnd"/>
-            <w:r>
-              <w:rPr>
-                <w:lang w:val="de-DE"/>
-              </w:rPr>
-              <w:t>} – {</w:t>
-            </w:r>
-            <w:proofErr w:type="spellStart"/>
-            <w:r>
-              <w:rPr>
-                <w:lang w:val="de-DE"/>
-              </w:rPr>
-              <w:t>DateBestPoints</w:t>
-            </w:r>
-            <w:proofErr w:type="spellEnd"/>
-            <w:r>
-              <w:rPr>
-                <w:lang w:val="de-DE"/>
-              </w:rPr>
-              <w:t>}</w:t>
+              <w:t>{BestPoints} – {DateBestPoints}</w:t>
             </w:r>
             <w:r>
               <w:rPr>
@@ -426,21 +323,7 @@
               <w:rPr>
                 <w:lang w:val="de-DE"/>
               </w:rPr>
-              <w:t>{</w:t>
-            </w:r>
-            <w:proofErr w:type="spellStart"/>
-            <w:r>
-              <w:rPr>
-                <w:lang w:val="de-DE"/>
-              </w:rPr>
-              <w:t>LocBestPoints</w:t>
-            </w:r>
-            <w:proofErr w:type="spellEnd"/>
-            <w:r>
-              <w:rPr>
-                <w:lang w:val="de-DE"/>
-              </w:rPr>
-              <w:t>}</w:t>
+              <w:t>{LocBestPoints}</w:t>
             </w:r>
           </w:p>
         </w:tc>
@@ -481,21 +364,7 @@
               <w:rPr>
                 <w:lang w:val="de-DE"/>
               </w:rPr>
-              <w:t>{</w:t>
-            </w:r>
-            <w:proofErr w:type="spellStart"/>
-            <w:r>
-              <w:rPr>
-                <w:lang w:val="de-DE"/>
-              </w:rPr>
-              <w:t>AvgPoints</w:t>
-            </w:r>
-            <w:proofErr w:type="spellEnd"/>
-            <w:r>
-              <w:rPr>
-                <w:lang w:val="de-DE"/>
-              </w:rPr>
-              <w:t>}</w:t>
+              <w:t>{AvgPoints}</w:t>
             </w:r>
           </w:p>
         </w:tc>
@@ -539,35 +408,7 @@
               <w:rPr>
                 <w:lang w:val="de-DE"/>
               </w:rPr>
-              <w:t>{</w:t>
-            </w:r>
-            <w:proofErr w:type="spellStart"/>
-            <w:r>
-              <w:rPr>
-                <w:lang w:val="de-DE"/>
-              </w:rPr>
-              <w:t>BestCat</w:t>
-            </w:r>
-            <w:proofErr w:type="spellEnd"/>
-            <w:r>
-              <w:rPr>
-                <w:lang w:val="de-DE"/>
-              </w:rPr>
-              <w:t>} – Pos. {</w:t>
-            </w:r>
-            <w:proofErr w:type="spellStart"/>
-            <w:r>
-              <w:rPr>
-                <w:lang w:val="de-DE"/>
-              </w:rPr>
-              <w:t>BestCatPos</w:t>
-            </w:r>
-            <w:proofErr w:type="spellEnd"/>
-            <w:r>
-              <w:rPr>
-                <w:lang w:val="de-DE"/>
-              </w:rPr>
-              <w:t>}</w:t>
+              <w:t>{BestCat} – Pos. {BestCatPos}</w:t>
             </w:r>
           </w:p>
         </w:tc>
@@ -589,7 +430,7 @@
               <w:rPr>
                 <w:lang w:val="de-DE"/>
               </w:rPr>
-              <w:t>Teilnahmen</w:t>
+              <w:t>Bonus Effizienz</w:t>
             </w:r>
           </w:p>
         </w:tc>
@@ -608,35 +449,51 @@
               <w:rPr>
                 <w:lang w:val="de-DE"/>
               </w:rPr>
-              <w:t>{</w:t>
-            </w:r>
-            <w:proofErr w:type="spellStart"/>
-            <w:r>
-              <w:rPr>
-                <w:lang w:val="de-DE"/>
-              </w:rPr>
-              <w:t>Participations</w:t>
-            </w:r>
-            <w:proofErr w:type="spellEnd"/>
-            <w:r>
-              <w:rPr>
-                <w:lang w:val="de-DE"/>
-              </w:rPr>
-              <w:t>}/{</w:t>
-            </w:r>
-            <w:proofErr w:type="spellStart"/>
-            <w:r>
-              <w:rPr>
-                <w:lang w:val="de-DE"/>
-              </w:rPr>
-              <w:t>nRoundsPlayed</w:t>
-            </w:r>
-            <w:proofErr w:type="spellEnd"/>
-            <w:r>
-              <w:rPr>
-                <w:lang w:val="de-DE"/>
-              </w:rPr>
-              <w:t>}</w:t>
+              <w:t>{BonusEff}</w:t>
+            </w:r>
+          </w:p>
+        </w:tc>
+      </w:tr>
+      <w:tr>
+        <w:trPr>
+          <w:cnfStyle w:val="000000100000" w:firstRow="0" w:lastRow="0" w:firstColumn="0" w:lastColumn="0" w:oddVBand="0" w:evenVBand="0" w:oddHBand="1" w:evenHBand="0" w:firstRowFirstColumn="0" w:firstRowLastColumn="0" w:lastRowFirstColumn="0" w:lastRowLastColumn="0"/>
+        </w:trPr>
+        <w:tc>
+          <w:tcPr>
+            <w:cnfStyle w:val="001000000000" w:firstRow="0" w:lastRow="0" w:firstColumn="1" w:lastColumn="0" w:oddVBand="0" w:evenVBand="0" w:oddHBand="0" w:evenHBand="0" w:firstRowFirstColumn="0" w:firstRowLastColumn="0" w:lastRowFirstColumn="0" w:lastRowLastColumn="0"/>
+            <w:tcW w:w="2977" w:type="dxa"/>
+          </w:tcPr>
+          <w:p>
+            <w:pPr>
+              <w:jc w:val="right"/>
+              <w:rPr>
+                <w:lang w:val="de-DE"/>
+              </w:rPr>
+            </w:pPr>
+            <w:r>
+              <w:rPr>
+                <w:lang w:val="de-DE"/>
+              </w:rPr>
+              <w:t>Teilnahmen</w:t>
+            </w:r>
+          </w:p>
+        </w:tc>
+        <w:tc>
+          <w:tcPr>
+            <w:tcW w:w="7479" w:type="dxa"/>
+          </w:tcPr>
+          <w:p>
+            <w:pPr>
+              <w:cnfStyle w:val="000000100000" w:firstRow="0" w:lastRow="0" w:firstColumn="0" w:lastColumn="0" w:oddVBand="0" w:evenVBand="0" w:oddHBand="1" w:evenHBand="0" w:firstRowFirstColumn="0" w:firstRowLastColumn="0" w:lastRowFirstColumn="0" w:lastRowLastColumn="0"/>
+              <w:rPr>
+                <w:lang w:val="de-DE"/>
+              </w:rPr>
+            </w:pPr>
+            <w:r>
+              <w:rPr>
+                <w:lang w:val="de-DE"/>
+              </w:rPr>
+              <w:t>{Participations}/{nRoundsPlayed}</w:t>
             </w:r>
           </w:p>
         </w:tc>
@@ -923,33 +780,8 @@
         <w:sz w:val="12"/>
         <w:szCs w:val="12"/>
       </w:rPr>
-      <w:t xml:space="preserve">Report </w:t>
+      <w:t>Report generated by</w:t>
     </w:r>
-    <w:proofErr w:type="spellStart"/>
-    <w:r>
-      <w:rPr>
-        <w:sz w:val="12"/>
-        <w:szCs w:val="12"/>
-      </w:rPr>
-      <w:t>generated</w:t>
-    </w:r>
-    <w:proofErr w:type="spellEnd"/>
-    <w:r>
-      <w:rPr>
-        <w:sz w:val="12"/>
-        <w:szCs w:val="12"/>
-      </w:rPr>
-      <w:t xml:space="preserve"> </w:t>
-    </w:r>
-    <w:proofErr w:type="spellStart"/>
-    <w:r>
-      <w:rPr>
-        <w:sz w:val="12"/>
-        <w:szCs w:val="12"/>
-      </w:rPr>
-      <w:t>by</w:t>
-    </w:r>
-    <w:proofErr w:type="spellEnd"/>
     <w:r>
       <w:rPr>
         <w:sz w:val="12"/>

</xml_diff>

<commit_message>
feat: Add leaderboard functionality for championship, averages, and bonus efficiency reports
</commit_message>
<xml_diff>
--- a/data/templates/TeamReportTemplate.docx
+++ b/data/templates/TeamReportTemplate.docx
@@ -14,10 +14,10 @@
           <w:lang w:val="de-DE"/>
         </w:rPr>
         <w:drawing>
-          <wp:anchor distT="0" distB="0" distL="114300" distR="114300" simplePos="0" relativeHeight="251658240" behindDoc="1" locked="0" layoutInCell="1" allowOverlap="1" wp14:anchorId="36C96E25" wp14:editId="7DF198F7">
+          <wp:anchor distT="0" distB="0" distL="114300" distR="114300" simplePos="0" relativeHeight="251657216" behindDoc="1" locked="0" layoutInCell="1" allowOverlap="1" wp14:anchorId="36C96E25" wp14:editId="2C37258B">
             <wp:simplePos x="0" y="0"/>
             <wp:positionH relativeFrom="margin">
-              <wp:align>right</wp:align>
+              <wp:posOffset>4988560</wp:posOffset>
             </wp:positionH>
             <wp:positionV relativeFrom="paragraph">
               <wp:posOffset>90805</wp:posOffset>
@@ -108,6 +108,379 @@
           <w:lang w:val="de-DE"/>
         </w:rPr>
       </w:pPr>
+      <w:r>
+        <w:rPr>
+          <w:noProof/>
+          <w:lang w:val="de-DE"/>
+        </w:rPr>
+        <mc:AlternateContent>
+          <mc:Choice Requires="wpg">
+            <w:drawing>
+              <wp:anchor distT="0" distB="0" distL="114300" distR="114300" simplePos="0" relativeHeight="251672576" behindDoc="0" locked="0" layoutInCell="1" allowOverlap="1" wp14:anchorId="0D65DE78" wp14:editId="1FA9FC38">
+                <wp:simplePos x="0" y="0"/>
+                <wp:positionH relativeFrom="column">
+                  <wp:posOffset>5074617</wp:posOffset>
+                </wp:positionH>
+                <wp:positionV relativeFrom="paragraph">
+                  <wp:posOffset>45892</wp:posOffset>
+                </wp:positionV>
+                <wp:extent cx="1485900" cy="810260"/>
+                <wp:effectExtent l="0" t="0" r="0" b="0"/>
+                <wp:wrapNone/>
+                <wp:docPr id="1098094065" name="Gruppieren 4"/>
+                <wp:cNvGraphicFramePr/>
+                <a:graphic xmlns:a="http://schemas.openxmlformats.org/drawingml/2006/main">
+                  <a:graphicData uri="http://schemas.microsoft.com/office/word/2010/wordprocessingGroup">
+                    <wpg:wgp>
+                      <wpg:cNvGrpSpPr/>
+                      <wpg:grpSpPr>
+                        <a:xfrm>
+                          <a:off x="0" y="0"/>
+                          <a:ext cx="1485900" cy="810260"/>
+                          <a:chOff x="0" y="0"/>
+                          <a:chExt cx="1485900" cy="810260"/>
+                        </a:xfrm>
+                      </wpg:grpSpPr>
+                      <pic:pic xmlns:pic="http://schemas.openxmlformats.org/drawingml/2006/picture">
+                        <pic:nvPicPr>
+                          <pic:cNvPr id="965346426" name="Grafik 2"/>
+                          <pic:cNvPicPr>
+                            <a:picLocks noChangeAspect="1"/>
+                          </pic:cNvPicPr>
+                        </pic:nvPicPr>
+                        <pic:blipFill>
+                          <a:blip r:embed="rId7" cstate="print">
+                            <a:extLst>
+                              <a:ext uri="{28A0092B-C50C-407E-A947-70E740481C1C}">
+                                <a14:useLocalDpi xmlns:a14="http://schemas.microsoft.com/office/drawing/2010/main" val="0"/>
+                              </a:ext>
+                            </a:extLst>
+                          </a:blip>
+                          <a:stretch>
+                            <a:fillRect/>
+                          </a:stretch>
+                        </pic:blipFill>
+                        <pic:spPr>
+                          <a:xfrm>
+                            <a:off x="0" y="0"/>
+                            <a:ext cx="1485900" cy="810260"/>
+                          </a:xfrm>
+                          <a:prstGeom prst="rect">
+                            <a:avLst/>
+                          </a:prstGeom>
+                        </pic:spPr>
+                      </pic:pic>
+                      <wps:wsp>
+                        <wps:cNvPr id="203951684" name="Textfeld 3"/>
+                        <wps:cNvSpPr txBox="1"/>
+                        <wps:spPr>
+                          <a:xfrm>
+                            <a:off x="935595" y="327004"/>
+                            <a:ext cx="517756" cy="269240"/>
+                          </a:xfrm>
+                          <a:prstGeom prst="rect">
+                            <a:avLst/>
+                          </a:prstGeom>
+                          <a:noFill/>
+                          <a:ln w="6350">
+                            <a:noFill/>
+                          </a:ln>
+                        </wps:spPr>
+                        <wps:txbx>
+                          <w:txbxContent>
+                            <w:p>
+                              <w:pPr>
+                                <w:jc w:val="center"/>
+                                <w:rPr>
+                                  <w:sz w:val="18"/>
+                                  <w:szCs w:val="18"/>
+                                  <w:lang w:val="de-DE"/>
+                                </w:rPr>
+                              </w:pPr>
+                              <w:r>
+                                <w:rPr>
+                                  <w:sz w:val="18"/>
+                                  <w:szCs w:val="18"/>
+                                  <w:lang w:val="de-DE"/>
+                                </w:rPr>
+                                <w:t>{</w:t>
+                              </w:r>
+                              <w:r>
+                                <w:rPr>
+                                  <w:sz w:val="18"/>
+                                  <w:szCs w:val="18"/>
+                                  <w:lang w:val="de-DE"/>
+                                </w:rPr>
+                                <w:t>3</w:t>
+                              </w:r>
+                              <w:r>
+                                <w:rPr>
+                                  <w:sz w:val="18"/>
+                                  <w:szCs w:val="18"/>
+                                  <w:lang w:val="de-DE"/>
+                                </w:rPr>
+                                <w:t>}</w:t>
+                              </w:r>
+                            </w:p>
+                          </w:txbxContent>
+                        </wps:txbx>
+                        <wps:bodyPr rot="0" spcFirstLastPara="0" vertOverflow="overflow" horzOverflow="overflow" vert="horz" wrap="square" lIns="91440" tIns="45720" rIns="91440" bIns="45720" numCol="1" spcCol="0" rtlCol="0" fromWordArt="0" anchor="ctr" anchorCtr="0" forceAA="0" compatLnSpc="1">
+                          <a:prstTxWarp prst="textNoShape">
+                            <a:avLst/>
+                          </a:prstTxWarp>
+                          <a:noAutofit/>
+                        </wps:bodyPr>
+                      </wps:wsp>
+                      <wps:wsp>
+                        <wps:cNvPr id="1365000425" name="Textfeld 3"/>
+                        <wps:cNvSpPr txBox="1"/>
+                        <wps:spPr>
+                          <a:xfrm>
+                            <a:off x="499590" y="327004"/>
+                            <a:ext cx="496561" cy="269240"/>
+                          </a:xfrm>
+                          <a:prstGeom prst="rect">
+                            <a:avLst/>
+                          </a:prstGeom>
+                          <a:noFill/>
+                          <a:ln w="6350">
+                            <a:noFill/>
+                          </a:ln>
+                        </wps:spPr>
+                        <wps:txbx>
+                          <w:txbxContent>
+                            <w:p>
+                              <w:pPr>
+                                <w:jc w:val="center"/>
+                                <w:rPr>
+                                  <w:sz w:val="18"/>
+                                  <w:szCs w:val="18"/>
+                                  <w:lang w:val="de-DE"/>
+                                </w:rPr>
+                              </w:pPr>
+                              <w:r>
+                                <w:rPr>
+                                  <w:sz w:val="18"/>
+                                  <w:szCs w:val="18"/>
+                                  <w:lang w:val="de-DE"/>
+                                </w:rPr>
+                                <w:t>{</w:t>
+                              </w:r>
+                              <w:r>
+                                <w:rPr>
+                                  <w:sz w:val="18"/>
+                                  <w:szCs w:val="18"/>
+                                  <w:lang w:val="de-DE"/>
+                                </w:rPr>
+                                <w:t>2</w:t>
+                              </w:r>
+                              <w:r>
+                                <w:rPr>
+                                  <w:sz w:val="18"/>
+                                  <w:szCs w:val="18"/>
+                                  <w:lang w:val="de-DE"/>
+                                </w:rPr>
+                                <w:t>}</w:t>
+                              </w:r>
+                            </w:p>
+                          </w:txbxContent>
+                        </wps:txbx>
+                        <wps:bodyPr rot="0" spcFirstLastPara="0" vertOverflow="overflow" horzOverflow="overflow" vert="horz" wrap="square" lIns="91440" tIns="45720" rIns="91440" bIns="45720" numCol="1" spcCol="0" rtlCol="0" fromWordArt="0" anchor="ctr" anchorCtr="0" forceAA="0" compatLnSpc="1">
+                          <a:prstTxWarp prst="textNoShape">
+                            <a:avLst/>
+                          </a:prstTxWarp>
+                          <a:noAutofit/>
+                        </wps:bodyPr>
+                      </wps:wsp>
+                      <wps:wsp>
+                        <wps:cNvPr id="2111450685" name="Textfeld 3"/>
+                        <wps:cNvSpPr txBox="1"/>
+                        <wps:spPr>
+                          <a:xfrm>
+                            <a:off x="42390" y="327004"/>
+                            <a:ext cx="496561" cy="269240"/>
+                          </a:xfrm>
+                          <a:prstGeom prst="rect">
+                            <a:avLst/>
+                          </a:prstGeom>
+                          <a:noFill/>
+                          <a:ln w="6350">
+                            <a:noFill/>
+                          </a:ln>
+                        </wps:spPr>
+                        <wps:txbx>
+                          <w:txbxContent>
+                            <w:p>
+                              <w:pPr>
+                                <w:jc w:val="center"/>
+                                <w:rPr>
+                                  <w:sz w:val="18"/>
+                                  <w:szCs w:val="18"/>
+                                  <w:lang w:val="de-DE"/>
+                                </w:rPr>
+                              </w:pPr>
+                              <w:r>
+                                <w:rPr>
+                                  <w:sz w:val="18"/>
+                                  <w:szCs w:val="18"/>
+                                  <w:lang w:val="de-DE"/>
+                                </w:rPr>
+                                <w:t>{1}</w:t>
+                              </w:r>
+                            </w:p>
+                          </w:txbxContent>
+                        </wps:txbx>
+                        <wps:bodyPr rot="0" spcFirstLastPara="0" vertOverflow="overflow" horzOverflow="overflow" vert="horz" wrap="square" lIns="91440" tIns="45720" rIns="91440" bIns="45720" numCol="1" spcCol="0" rtlCol="0" fromWordArt="0" anchor="ctr" anchorCtr="0" forceAA="0" compatLnSpc="1">
+                          <a:prstTxWarp prst="textNoShape">
+                            <a:avLst/>
+                          </a:prstTxWarp>
+                          <a:noAutofit/>
+                        </wps:bodyPr>
+                      </wps:wsp>
+                    </wpg:wgp>
+                  </a:graphicData>
+                </a:graphic>
+              </wp:anchor>
+            </w:drawing>
+          </mc:Choice>
+          <mc:Fallback>
+            <w:pict>
+              <v:group w14:anchorId="0D65DE78" id="Gruppieren 4" o:spid="_x0000_s1026" style="position:absolute;margin-left:399.6pt;margin-top:3.6pt;width:117pt;height:63.8pt;z-index:251672576" coordsize="14859,8102" o:gfxdata="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">
+                <v:shapetype id="_x0000_t75" coordsize="21600,21600" o:spt="75" o:preferrelative="t" path="m@4@5l@4@11@9@11@9@5xe" filled="f" stroked="f">
+                  <v:stroke joinstyle="miter"/>
+                  <v:formulas>
+                    <v:f eqn="if lineDrawn pixelLineWidth 0"/>
+                    <v:f eqn="sum @0 1 0"/>
+                    <v:f eqn="sum 0 0 @1"/>
+                    <v:f eqn="prod @2 1 2"/>
+                    <v:f eqn="prod @3 21600 pixelWidth"/>
+                    <v:f eqn="prod @3 21600 pixelHeight"/>
+                    <v:f eqn="sum @0 0 1"/>
+                    <v:f eqn="prod @6 1 2"/>
+                    <v:f eqn="prod @7 21600 pixelWidth"/>
+                    <v:f eqn="sum @8 21600 0"/>
+                    <v:f eqn="prod @7 21600 pixelHeight"/>
+                    <v:f eqn="sum @10 21600 0"/>
+                  </v:formulas>
+                  <v:path o:extrusionok="f" gradientshapeok="t" o:connecttype="rect"/>
+                  <o:lock v:ext="edit" aspectratio="t"/>
+                </v:shapetype>
+                <v:shape id="Grafik 2" o:spid="_x0000_s1027" type="#_x0000_t75" style="position:absolute;width:14859;height:8102;visibility:visible;mso-wrap-style:square" o:gfxdata="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">
+                  <v:imagedata r:id="rId8" o:title=""/>
+                </v:shape>
+                <v:shapetype id="_x0000_t202" coordsize="21600,21600" o:spt="202" path="m,l,21600r21600,l21600,xe">
+                  <v:stroke joinstyle="miter"/>
+                  <v:path gradientshapeok="t" o:connecttype="rect"/>
+                </v:shapetype>
+                <v:shape id="Textfeld 3" o:spid="_x0000_s1028" type="#_x0000_t202" style="position:absolute;left:9355;top:3270;width:5178;height:2692;visibility:visible;mso-wrap-style:square;v-text-anchor:middle" o:gfxdata="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" filled="f" stroked="f" strokeweight=".5pt">
+                  <v:textbox>
+                    <w:txbxContent>
+                      <w:p>
+                        <w:pPr>
+                          <w:jc w:val="center"/>
+                          <w:rPr>
+                            <w:sz w:val="18"/>
+                            <w:szCs w:val="18"/>
+                            <w:lang w:val="de-DE"/>
+                          </w:rPr>
+                        </w:pPr>
+                        <w:r>
+                          <w:rPr>
+                            <w:sz w:val="18"/>
+                            <w:szCs w:val="18"/>
+                            <w:lang w:val="de-DE"/>
+                          </w:rPr>
+                          <w:t>{</w:t>
+                        </w:r>
+                        <w:r>
+                          <w:rPr>
+                            <w:sz w:val="18"/>
+                            <w:szCs w:val="18"/>
+                            <w:lang w:val="de-DE"/>
+                          </w:rPr>
+                          <w:t>3</w:t>
+                        </w:r>
+                        <w:r>
+                          <w:rPr>
+                            <w:sz w:val="18"/>
+                            <w:szCs w:val="18"/>
+                            <w:lang w:val="de-DE"/>
+                          </w:rPr>
+                          <w:t>}</w:t>
+                        </w:r>
+                      </w:p>
+                    </w:txbxContent>
+                  </v:textbox>
+                </v:shape>
+                <v:shape id="Textfeld 3" o:spid="_x0000_s1029" type="#_x0000_t202" style="position:absolute;left:4995;top:3270;width:4966;height:2692;visibility:visible;mso-wrap-style:square;v-text-anchor:middle" o:gfxdata="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" filled="f" stroked="f" strokeweight=".5pt">
+                  <v:textbox>
+                    <w:txbxContent>
+                      <w:p>
+                        <w:pPr>
+                          <w:jc w:val="center"/>
+                          <w:rPr>
+                            <w:sz w:val="18"/>
+                            <w:szCs w:val="18"/>
+                            <w:lang w:val="de-DE"/>
+                          </w:rPr>
+                        </w:pPr>
+                        <w:r>
+                          <w:rPr>
+                            <w:sz w:val="18"/>
+                            <w:szCs w:val="18"/>
+                            <w:lang w:val="de-DE"/>
+                          </w:rPr>
+                          <w:t>{</w:t>
+                        </w:r>
+                        <w:r>
+                          <w:rPr>
+                            <w:sz w:val="18"/>
+                            <w:szCs w:val="18"/>
+                            <w:lang w:val="de-DE"/>
+                          </w:rPr>
+                          <w:t>2</w:t>
+                        </w:r>
+                        <w:r>
+                          <w:rPr>
+                            <w:sz w:val="18"/>
+                            <w:szCs w:val="18"/>
+                            <w:lang w:val="de-DE"/>
+                          </w:rPr>
+                          <w:t>}</w:t>
+                        </w:r>
+                      </w:p>
+                    </w:txbxContent>
+                  </v:textbox>
+                </v:shape>
+                <v:shape id="Textfeld 3" o:spid="_x0000_s1030" type="#_x0000_t202" style="position:absolute;left:423;top:3270;width:4966;height:2692;visibility:visible;mso-wrap-style:square;v-text-anchor:middle" o:gfxdata="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" filled="f" stroked="f" strokeweight=".5pt">
+                  <v:textbox>
+                    <w:txbxContent>
+                      <w:p>
+                        <w:pPr>
+                          <w:jc w:val="center"/>
+                          <w:rPr>
+                            <w:sz w:val="18"/>
+                            <w:szCs w:val="18"/>
+                            <w:lang w:val="de-DE"/>
+                          </w:rPr>
+                        </w:pPr>
+                        <w:r>
+                          <w:rPr>
+                            <w:sz w:val="18"/>
+                            <w:szCs w:val="18"/>
+                            <w:lang w:val="de-DE"/>
+                          </w:rPr>
+                          <w:t>{1}</w:t>
+                        </w:r>
+                      </w:p>
+                    </w:txbxContent>
+                  </v:textbox>
+                </v:shape>
+              </v:group>
+            </w:pict>
+          </mc:Fallback>
+        </mc:AlternateContent>
+      </w:r>
     </w:p>
     <w:tbl>
       <w:tblPr>
@@ -116,17 +489,18 @@
         <w:tblLook w:val="04A0" w:firstRow="1" w:lastRow="0" w:firstColumn="1" w:lastColumn="0" w:noHBand="0" w:noVBand="1"/>
       </w:tblPr>
       <w:tblGrid>
-        <w:gridCol w:w="2977"/>
-        <w:gridCol w:w="7479"/>
+        <w:gridCol w:w="3488"/>
+        <w:gridCol w:w="4587"/>
       </w:tblGrid>
       <w:tr>
         <w:trPr>
           <w:cnfStyle w:val="100000000000" w:firstRow="1" w:lastRow="0" w:firstColumn="0" w:lastColumn="0" w:oddVBand="0" w:evenVBand="0" w:oddHBand="0" w:evenHBand="0" w:firstRowFirstColumn="0" w:firstRowLastColumn="0" w:lastRowFirstColumn="0" w:lastRowLastColumn="0"/>
+          <w:trHeight w:val="271"/>
         </w:trPr>
         <w:tc>
           <w:tcPr>
             <w:cnfStyle w:val="001000000000" w:firstRow="0" w:lastRow="0" w:firstColumn="1" w:lastColumn="0" w:oddVBand="0" w:evenVBand="0" w:oddHBand="0" w:evenHBand="0" w:firstRowFirstColumn="0" w:firstRowLastColumn="0" w:lastRowFirstColumn="0" w:lastRowLastColumn="0"/>
-            <w:tcW w:w="2977" w:type="dxa"/>
+            <w:tcW w:w="3488" w:type="dxa"/>
           </w:tcPr>
           <w:p>
             <w:pPr>
@@ -145,7 +519,7 @@
         </w:tc>
         <w:tc>
           <w:tcPr>
-            <w:tcW w:w="7479" w:type="dxa"/>
+            <w:tcW w:w="4587" w:type="dxa"/>
           </w:tcPr>
           <w:p>
             <w:pPr>
@@ -158,7 +532,21 @@
               <w:rPr>
                 <w:lang w:val="de-DE"/>
               </w:rPr>
-              <w:t>{ChampionshipPoints}</w:t>
+              <w:t>{</w:t>
+            </w:r>
+            <w:proofErr w:type="spellStart"/>
+            <w:r>
+              <w:rPr>
+                <w:lang w:val="de-DE"/>
+              </w:rPr>
+              <w:t>ChampionshipPoints</w:t>
+            </w:r>
+            <w:proofErr w:type="spellEnd"/>
+            <w:r>
+              <w:rPr>
+                <w:lang w:val="de-DE"/>
+              </w:rPr>
+              <w:t>}</w:t>
             </w:r>
           </w:p>
         </w:tc>
@@ -166,11 +554,12 @@
       <w:tr>
         <w:trPr>
           <w:cnfStyle w:val="000000100000" w:firstRow="0" w:lastRow="0" w:firstColumn="0" w:lastColumn="0" w:oddVBand="0" w:evenVBand="0" w:oddHBand="1" w:evenHBand="0" w:firstRowFirstColumn="0" w:firstRowLastColumn="0" w:lastRowFirstColumn="0" w:lastRowLastColumn="0"/>
+          <w:trHeight w:val="276"/>
         </w:trPr>
         <w:tc>
           <w:tcPr>
             <w:cnfStyle w:val="001000000000" w:firstRow="0" w:lastRow="0" w:firstColumn="1" w:lastColumn="0" w:oddVBand="0" w:evenVBand="0" w:oddHBand="0" w:evenHBand="0" w:firstRowFirstColumn="0" w:firstRowLastColumn="0" w:lastRowFirstColumn="0" w:lastRowLastColumn="0"/>
-            <w:tcW w:w="2977" w:type="dxa"/>
+            <w:tcW w:w="3488" w:type="dxa"/>
           </w:tcPr>
           <w:p>
             <w:pPr>
@@ -189,7 +578,7 @@
         </w:tc>
         <w:tc>
           <w:tcPr>
-            <w:tcW w:w="7479" w:type="dxa"/>
+            <w:tcW w:w="4587" w:type="dxa"/>
           </w:tcPr>
           <w:p>
             <w:pPr>
@@ -202,7 +591,21 @@
               <w:rPr>
                 <w:lang w:val="de-DE"/>
               </w:rPr>
-              <w:t>{ChampionshipPosition}</w:t>
+              <w:t>{</w:t>
+            </w:r>
+            <w:proofErr w:type="spellStart"/>
+            <w:r>
+              <w:rPr>
+                <w:lang w:val="de-DE"/>
+              </w:rPr>
+              <w:t>ChampionshipPosition</w:t>
+            </w:r>
+            <w:proofErr w:type="spellEnd"/>
+            <w:r>
+              <w:rPr>
+                <w:lang w:val="de-DE"/>
+              </w:rPr>
+              <w:t>}</w:t>
             </w:r>
             <w:r>
               <w:rPr>
@@ -214,10 +617,13 @@
         </w:tc>
       </w:tr>
       <w:tr>
+        <w:trPr>
+          <w:trHeight w:val="271"/>
+        </w:trPr>
         <w:tc>
           <w:tcPr>
             <w:cnfStyle w:val="001000000000" w:firstRow="0" w:lastRow="0" w:firstColumn="1" w:lastColumn="0" w:oddVBand="0" w:evenVBand="0" w:oddHBand="0" w:evenHBand="0" w:firstRowFirstColumn="0" w:firstRowLastColumn="0" w:lastRowFirstColumn="0" w:lastRowLastColumn="0"/>
-            <w:tcW w:w="2977" w:type="dxa"/>
+            <w:tcW w:w="3488" w:type="dxa"/>
           </w:tcPr>
           <w:p>
             <w:pPr>
@@ -236,7 +642,7 @@
         </w:tc>
         <w:tc>
           <w:tcPr>
-            <w:tcW w:w="7479" w:type="dxa"/>
+            <w:tcW w:w="4587" w:type="dxa"/>
           </w:tcPr>
           <w:p>
             <w:pPr>
@@ -249,7 +655,35 @@
               <w:rPr>
                 <w:lang w:val="de-DE"/>
               </w:rPr>
-              <w:t xml:space="preserve">{BestPos} – {DateBestPos} </w:t>
+              <w:t>{</w:t>
+            </w:r>
+            <w:proofErr w:type="spellStart"/>
+            <w:r>
+              <w:rPr>
+                <w:lang w:val="de-DE"/>
+              </w:rPr>
+              <w:t>BestPos</w:t>
+            </w:r>
+            <w:proofErr w:type="spellEnd"/>
+            <w:r>
+              <w:rPr>
+                <w:lang w:val="de-DE"/>
+              </w:rPr>
+              <w:t>} – {</w:t>
+            </w:r>
+            <w:proofErr w:type="spellStart"/>
+            <w:r>
+              <w:rPr>
+                <w:lang w:val="de-DE"/>
+              </w:rPr>
+              <w:t>DateBestPos</w:t>
+            </w:r>
+            <w:proofErr w:type="spellEnd"/>
+            <w:r>
+              <w:rPr>
+                <w:lang w:val="de-DE"/>
+              </w:rPr>
+              <w:t xml:space="preserve">} </w:t>
             </w:r>
             <w:r>
               <w:rPr>
@@ -261,8 +695,16 @@
               <w:rPr>
                 <w:lang w:val="de-DE"/>
               </w:rPr>
-              <w:t xml:space="preserve"> {LocBestPos</w:t>
-            </w:r>
+              <w:t xml:space="preserve"> {</w:t>
+            </w:r>
+            <w:proofErr w:type="spellStart"/>
+            <w:r>
+              <w:rPr>
+                <w:lang w:val="de-DE"/>
+              </w:rPr>
+              <w:t>LocBestPos</w:t>
+            </w:r>
+            <w:proofErr w:type="spellEnd"/>
             <w:r>
               <w:rPr>
                 <w:lang w:val="de-DE"/>
@@ -275,11 +717,12 @@
       <w:tr>
         <w:trPr>
           <w:cnfStyle w:val="000000100000" w:firstRow="0" w:lastRow="0" w:firstColumn="0" w:lastColumn="0" w:oddVBand="0" w:evenVBand="0" w:oddHBand="1" w:evenHBand="0" w:firstRowFirstColumn="0" w:firstRowLastColumn="0" w:lastRowFirstColumn="0" w:lastRowLastColumn="0"/>
+          <w:trHeight w:val="271"/>
         </w:trPr>
         <w:tc>
           <w:tcPr>
             <w:cnfStyle w:val="001000000000" w:firstRow="0" w:lastRow="0" w:firstColumn="1" w:lastColumn="0" w:oddVBand="0" w:evenVBand="0" w:oddHBand="0" w:evenHBand="0" w:firstRowFirstColumn="0" w:firstRowLastColumn="0" w:lastRowFirstColumn="0" w:lastRowLastColumn="0"/>
-            <w:tcW w:w="2977" w:type="dxa"/>
+            <w:tcW w:w="3488" w:type="dxa"/>
           </w:tcPr>
           <w:p>
             <w:pPr>
@@ -298,7 +741,7 @@
         </w:tc>
         <w:tc>
           <w:tcPr>
-            <w:tcW w:w="7479" w:type="dxa"/>
+            <w:tcW w:w="4587" w:type="dxa"/>
           </w:tcPr>
           <w:p>
             <w:pPr>
@@ -311,7 +754,47 @@
               <w:rPr>
                 <w:lang w:val="de-DE"/>
               </w:rPr>
-              <w:t>{BestPoints} – {DateBestPoints}</w:t>
+              <w:t>{</w:t>
+            </w:r>
+            <w:proofErr w:type="spellStart"/>
+            <w:r>
+              <w:rPr>
+                <w:lang w:val="de-DE"/>
+              </w:rPr>
+              <w:t>BestP</w:t>
+            </w:r>
+            <w:r>
+              <w:rPr>
+                <w:lang w:val="de-DE"/>
+              </w:rPr>
+              <w:t>ts</w:t>
+            </w:r>
+            <w:proofErr w:type="spellEnd"/>
+            <w:r>
+              <w:rPr>
+                <w:lang w:val="de-DE"/>
+              </w:rPr>
+              <w:t>} – {</w:t>
+            </w:r>
+            <w:proofErr w:type="spellStart"/>
+            <w:r>
+              <w:rPr>
+                <w:lang w:val="de-DE"/>
+              </w:rPr>
+              <w:t>DateBestP</w:t>
+            </w:r>
+            <w:r>
+              <w:rPr>
+                <w:lang w:val="de-DE"/>
+              </w:rPr>
+              <w:t>ts</w:t>
+            </w:r>
+            <w:proofErr w:type="spellEnd"/>
+            <w:r>
+              <w:rPr>
+                <w:lang w:val="de-DE"/>
+              </w:rPr>
+              <w:t>}</w:t>
             </w:r>
             <w:r>
               <w:rPr>
@@ -323,16 +806,39 @@
               <w:rPr>
                 <w:lang w:val="de-DE"/>
               </w:rPr>
-              <w:t>{LocBestPoints}</w:t>
+              <w:t>{</w:t>
+            </w:r>
+            <w:proofErr w:type="spellStart"/>
+            <w:r>
+              <w:rPr>
+                <w:lang w:val="de-DE"/>
+              </w:rPr>
+              <w:t>LocBestP</w:t>
+            </w:r>
+            <w:r>
+              <w:rPr>
+                <w:lang w:val="de-DE"/>
+              </w:rPr>
+              <w:t>ts</w:t>
+            </w:r>
+            <w:proofErr w:type="spellEnd"/>
+            <w:r>
+              <w:rPr>
+                <w:lang w:val="de-DE"/>
+              </w:rPr>
+              <w:t>}</w:t>
             </w:r>
           </w:p>
         </w:tc>
       </w:tr>
       <w:tr>
+        <w:trPr>
+          <w:trHeight w:val="276"/>
+        </w:trPr>
         <w:tc>
           <w:tcPr>
             <w:cnfStyle w:val="001000000000" w:firstRow="0" w:lastRow="0" w:firstColumn="1" w:lastColumn="0" w:oddVBand="0" w:evenVBand="0" w:oddHBand="0" w:evenHBand="0" w:firstRowFirstColumn="0" w:firstRowLastColumn="0" w:lastRowFirstColumn="0" w:lastRowLastColumn="0"/>
-            <w:tcW w:w="2977" w:type="dxa"/>
+            <w:tcW w:w="3488" w:type="dxa"/>
           </w:tcPr>
           <w:p>
             <w:pPr>
@@ -351,7 +857,7 @@
         </w:tc>
         <w:tc>
           <w:tcPr>
-            <w:tcW w:w="7479" w:type="dxa"/>
+            <w:tcW w:w="4587" w:type="dxa"/>
           </w:tcPr>
           <w:p>
             <w:pPr>
@@ -364,7 +870,21 @@
               <w:rPr>
                 <w:lang w:val="de-DE"/>
               </w:rPr>
-              <w:t>{AvgPoints}</w:t>
+              <w:t>{</w:t>
+            </w:r>
+            <w:proofErr w:type="spellStart"/>
+            <w:r>
+              <w:rPr>
+                <w:lang w:val="de-DE"/>
+              </w:rPr>
+              <w:t>AvgPoints</w:t>
+            </w:r>
+            <w:proofErr w:type="spellEnd"/>
+            <w:r>
+              <w:rPr>
+                <w:lang w:val="de-DE"/>
+              </w:rPr>
+              <w:t>}</w:t>
             </w:r>
           </w:p>
         </w:tc>
@@ -372,11 +892,12 @@
       <w:tr>
         <w:trPr>
           <w:cnfStyle w:val="000000100000" w:firstRow="0" w:lastRow="0" w:firstColumn="0" w:lastColumn="0" w:oddVBand="0" w:evenVBand="0" w:oddHBand="1" w:evenHBand="0" w:firstRowFirstColumn="0" w:firstRowLastColumn="0" w:lastRowFirstColumn="0" w:lastRowLastColumn="0"/>
+          <w:trHeight w:val="271"/>
         </w:trPr>
         <w:tc>
           <w:tcPr>
             <w:cnfStyle w:val="001000000000" w:firstRow="0" w:lastRow="0" w:firstColumn="1" w:lastColumn="0" w:oddVBand="0" w:evenVBand="0" w:oddHBand="0" w:evenHBand="0" w:firstRowFirstColumn="0" w:firstRowLastColumn="0" w:lastRowFirstColumn="0" w:lastRowLastColumn="0"/>
-            <w:tcW w:w="2977" w:type="dxa"/>
+            <w:tcW w:w="3488" w:type="dxa"/>
           </w:tcPr>
           <w:p>
             <w:pPr>
@@ -395,7 +916,7 @@
         </w:tc>
         <w:tc>
           <w:tcPr>
-            <w:tcW w:w="7479" w:type="dxa"/>
+            <w:tcW w:w="4587" w:type="dxa"/>
           </w:tcPr>
           <w:p>
             <w:pPr>
@@ -408,16 +929,47 @@
               <w:rPr>
                 <w:lang w:val="de-DE"/>
               </w:rPr>
-              <w:t>{BestCat} – Pos. {BestCatPos}</w:t>
+              <w:t>{</w:t>
+            </w:r>
+            <w:proofErr w:type="spellStart"/>
+            <w:r>
+              <w:rPr>
+                <w:lang w:val="de-DE"/>
+              </w:rPr>
+              <w:t>BestCat</w:t>
+            </w:r>
+            <w:proofErr w:type="spellEnd"/>
+            <w:r>
+              <w:rPr>
+                <w:lang w:val="de-DE"/>
+              </w:rPr>
+              <w:t>} – Pos. {</w:t>
+            </w:r>
+            <w:proofErr w:type="spellStart"/>
+            <w:r>
+              <w:rPr>
+                <w:lang w:val="de-DE"/>
+              </w:rPr>
+              <w:t>BestCatPos</w:t>
+            </w:r>
+            <w:proofErr w:type="spellEnd"/>
+            <w:r>
+              <w:rPr>
+                <w:lang w:val="de-DE"/>
+              </w:rPr>
+              <w:t>}</w:t>
             </w:r>
           </w:p>
         </w:tc>
       </w:tr>
       <w:tr>
+        <w:trPr>
+          <w:trHeight w:val="271"/>
+        </w:trPr>
         <w:tc>
           <w:tcPr>
             <w:cnfStyle w:val="001000000000" w:firstRow="0" w:lastRow="0" w:firstColumn="1" w:lastColumn="0" w:oddVBand="0" w:evenVBand="0" w:oddHBand="0" w:evenHBand="0" w:firstRowFirstColumn="0" w:firstRowLastColumn="0" w:lastRowFirstColumn="0" w:lastRowLastColumn="0"/>
-            <w:tcW w:w="2977" w:type="dxa"/>
+            <w:tcW w:w="3488" w:type="dxa"/>
           </w:tcPr>
           <w:p>
             <w:pPr>
@@ -436,7 +988,7 @@
         </w:tc>
         <w:tc>
           <w:tcPr>
-            <w:tcW w:w="7479" w:type="dxa"/>
+            <w:tcW w:w="4587" w:type="dxa"/>
           </w:tcPr>
           <w:p>
             <w:pPr>
@@ -449,7 +1001,21 @@
               <w:rPr>
                 <w:lang w:val="de-DE"/>
               </w:rPr>
-              <w:t>{BonusEff}</w:t>
+              <w:t>{</w:t>
+            </w:r>
+            <w:proofErr w:type="spellStart"/>
+            <w:r>
+              <w:rPr>
+                <w:lang w:val="de-DE"/>
+              </w:rPr>
+              <w:t>BonusEff</w:t>
+            </w:r>
+            <w:proofErr w:type="spellEnd"/>
+            <w:r>
+              <w:rPr>
+                <w:lang w:val="de-DE"/>
+              </w:rPr>
+              <w:t>}</w:t>
             </w:r>
           </w:p>
         </w:tc>
@@ -457,11 +1023,12 @@
       <w:tr>
         <w:trPr>
           <w:cnfStyle w:val="000000100000" w:firstRow="0" w:lastRow="0" w:firstColumn="0" w:lastColumn="0" w:oddVBand="0" w:evenVBand="0" w:oddHBand="1" w:evenHBand="0" w:firstRowFirstColumn="0" w:firstRowLastColumn="0" w:lastRowFirstColumn="0" w:lastRowLastColumn="0"/>
+          <w:trHeight w:val="276"/>
         </w:trPr>
         <w:tc>
           <w:tcPr>
             <w:cnfStyle w:val="001000000000" w:firstRow="0" w:lastRow="0" w:firstColumn="1" w:lastColumn="0" w:oddVBand="0" w:evenVBand="0" w:oddHBand="0" w:evenHBand="0" w:firstRowFirstColumn="0" w:firstRowLastColumn="0" w:lastRowFirstColumn="0" w:lastRowLastColumn="0"/>
-            <w:tcW w:w="2977" w:type="dxa"/>
+            <w:tcW w:w="3488" w:type="dxa"/>
           </w:tcPr>
           <w:p>
             <w:pPr>
@@ -480,7 +1047,7 @@
         </w:tc>
         <w:tc>
           <w:tcPr>
-            <w:tcW w:w="7479" w:type="dxa"/>
+            <w:tcW w:w="4587" w:type="dxa"/>
           </w:tcPr>
           <w:p>
             <w:pPr>
@@ -493,7 +1060,35 @@
               <w:rPr>
                 <w:lang w:val="de-DE"/>
               </w:rPr>
-              <w:t>{Participations}/{nRoundsPlayed}</w:t>
+              <w:t>{</w:t>
+            </w:r>
+            <w:proofErr w:type="spellStart"/>
+            <w:r>
+              <w:rPr>
+                <w:lang w:val="de-DE"/>
+              </w:rPr>
+              <w:t>Participations</w:t>
+            </w:r>
+            <w:proofErr w:type="spellEnd"/>
+            <w:r>
+              <w:rPr>
+                <w:lang w:val="de-DE"/>
+              </w:rPr>
+              <w:t>}/{</w:t>
+            </w:r>
+            <w:proofErr w:type="spellStart"/>
+            <w:r>
+              <w:rPr>
+                <w:lang w:val="de-DE"/>
+              </w:rPr>
+              <w:t>nRoundsPlayed</w:t>
+            </w:r>
+            <w:proofErr w:type="spellEnd"/>
+            <w:r>
+              <w:rPr>
+                <w:lang w:val="de-DE"/>
+              </w:rPr>
+              <w:t>}</w:t>
             </w:r>
           </w:p>
         </w:tc>
@@ -563,10 +1158,10 @@
                           <pic:cNvPicPr/>
                         </pic:nvPicPr>
                         <pic:blipFill>
-                          <a:blip r:embed="rId7">
+                          <a:blip r:embed="rId9">
                             <a:extLst>
                               <a:ext uri="{96DAC541-7B7A-43D3-8B79-37D633B846F1}">
-                                <asvg:svgBlip xmlns:asvg="http://schemas.microsoft.com/office/drawing/2016/SVG/main" r:embed="rId8"/>
+                                <asvg:svgBlip xmlns:asvg="http://schemas.microsoft.com/office/drawing/2016/SVG/main" r:embed="rId10"/>
                               </a:ext>
                             </a:extLst>
                           </a:blip>
@@ -623,10 +1218,10 @@
                           <pic:cNvPicPr/>
                         </pic:nvPicPr>
                         <pic:blipFill>
-                          <a:blip r:embed="rId7">
+                          <a:blip r:embed="rId9">
                             <a:extLst>
                               <a:ext uri="{96DAC541-7B7A-43D3-8B79-37D633B846F1}">
-                                <asvg:svgBlip xmlns:asvg="http://schemas.microsoft.com/office/drawing/2016/SVG/main" r:embed="rId8"/>
+                                <asvg:svgBlip xmlns:asvg="http://schemas.microsoft.com/office/drawing/2016/SVG/main" r:embed="rId10"/>
                               </a:ext>
                             </a:extLst>
                           </a:blip>
@@ -690,10 +1285,10 @@
                           <pic:cNvPicPr/>
                         </pic:nvPicPr>
                         <pic:blipFill>
-                          <a:blip r:embed="rId7">
+                          <a:blip r:embed="rId9">
                             <a:extLst>
                               <a:ext uri="{96DAC541-7B7A-43D3-8B79-37D633B846F1}">
-                                <asvg:svgBlip xmlns:asvg="http://schemas.microsoft.com/office/drawing/2016/SVG/main" r:embed="rId8"/>
+                                <asvg:svgBlip xmlns:asvg="http://schemas.microsoft.com/office/drawing/2016/SVG/main" r:embed="rId10"/>
                               </a:ext>
                             </a:extLst>
                           </a:blip>
@@ -730,7 +1325,7 @@
       </w:pPr>
     </w:p>
     <w:sectPr>
-      <w:footerReference w:type="default" r:id="rId9"/>
+      <w:footerReference w:type="default" r:id="rId11"/>
       <w:pgSz w:w="11906" w:h="16838"/>
       <w:pgMar w:top="720" w:right="720" w:bottom="720" w:left="720" w:header="708" w:footer="708" w:gutter="0"/>
       <w:cols w:space="708"/>
@@ -780,8 +1375,33 @@
         <w:sz w:val="12"/>
         <w:szCs w:val="12"/>
       </w:rPr>
-      <w:t>Report generated by</w:t>
+      <w:t xml:space="preserve">Report </w:t>
     </w:r>
+    <w:proofErr w:type="spellStart"/>
+    <w:r>
+      <w:rPr>
+        <w:sz w:val="12"/>
+        <w:szCs w:val="12"/>
+      </w:rPr>
+      <w:t>generated</w:t>
+    </w:r>
+    <w:proofErr w:type="spellEnd"/>
+    <w:r>
+      <w:rPr>
+        <w:sz w:val="12"/>
+        <w:szCs w:val="12"/>
+      </w:rPr>
+      <w:t xml:space="preserve"> </w:t>
+    </w:r>
+    <w:proofErr w:type="spellStart"/>
+    <w:r>
+      <w:rPr>
+        <w:sz w:val="12"/>
+        <w:szCs w:val="12"/>
+      </w:rPr>
+      <w:t>by</w:t>
+    </w:r>
+    <w:proofErr w:type="spellEnd"/>
     <w:r>
       <w:rPr>
         <w:sz w:val="12"/>

</xml_diff>